<commit_message>
Made doc of practical 2
</commit_message>
<xml_diff>
--- a/Practical's.docx
+++ b/Practical's.docx
@@ -19,8 +19,6 @@
         </w:rPr>
         <w:t>Practical No: 1</w:t>
       </w:r>
-      <w:bookmarkStart w:id="0" w:name="_GoBack"/>
-      <w:bookmarkEnd w:id="0"/>
     </w:p>
     <w:p>
       <w:pPr>
@@ -59,6 +57,7 @@
       </w:pPr>
       <w:r>
         <w:rPr>
+          <w:noProof/>
           <w:lang w:val="en-US"/>
         </w:rPr>
         <w:drawing>
@@ -113,6 +112,7 @@
       </w:r>
       <w:r>
         <w:rPr>
+          <w:noProof/>
           <w:sz w:val="28"/>
           <w:lang w:val="en-US"/>
         </w:rPr>
@@ -194,6 +194,7 @@
       </w:pPr>
       <w:r>
         <w:rPr>
+          <w:noProof/>
           <w:sz w:val="28"/>
           <w:lang w:val="en-US"/>
         </w:rPr>
@@ -274,6 +275,7 @@
       </w:pPr>
       <w:r>
         <w:rPr>
+          <w:noProof/>
           <w:sz w:val="28"/>
           <w:lang w:val="en-US"/>
         </w:rPr>
@@ -357,6 +359,7 @@
       </w:pPr>
       <w:r>
         <w:rPr>
+          <w:noProof/>
           <w:sz w:val="28"/>
           <w:lang w:val="en-US"/>
         </w:rPr>
@@ -419,6 +422,7 @@
       </w:r>
       <w:r>
         <w:rPr>
+          <w:noProof/>
           <w:sz w:val="28"/>
           <w:lang w:val="en-US"/>
         </w:rPr>
@@ -516,6 +520,7 @@
       </w:pPr>
       <w:r>
         <w:rPr>
+          <w:noProof/>
           <w:sz w:val="28"/>
           <w:lang w:val="en-US"/>
         </w:rPr>
@@ -566,6 +571,7 @@
       </w:pPr>
       <w:r>
         <w:rPr>
+          <w:noProof/>
           <w:sz w:val="28"/>
           <w:lang w:val="en-US"/>
         </w:rPr>
@@ -652,6 +658,7 @@
       </w:pPr>
       <w:r>
         <w:rPr>
+          <w:noProof/>
           <w:sz w:val="28"/>
           <w:lang w:val="en-US"/>
         </w:rPr>
@@ -702,6 +709,7 @@
       </w:pPr>
       <w:r>
         <w:rPr>
+          <w:noProof/>
           <w:sz w:val="28"/>
           <w:lang w:val="en-US"/>
         </w:rPr>
@@ -796,6 +804,7 @@
       </w:pPr>
       <w:r>
         <w:rPr>
+          <w:noProof/>
           <w:sz w:val="28"/>
           <w:lang w:val="en-US"/>
         </w:rPr>
@@ -845,6 +854,7 @@
       </w:pPr>
       <w:r>
         <w:rPr>
+          <w:noProof/>
           <w:sz w:val="28"/>
           <w:lang w:val="en-US"/>
         </w:rPr>
@@ -925,6 +935,7 @@
       </w:pPr>
       <w:r>
         <w:rPr>
+          <w:noProof/>
           <w:sz w:val="28"/>
           <w:lang w:val="en-US"/>
         </w:rPr>
@@ -980,6 +991,7 @@
       </w:r>
       <w:r>
         <w:rPr>
+          <w:noProof/>
           <w:sz w:val="28"/>
           <w:lang w:val="en-US"/>
         </w:rPr>
@@ -1207,6 +1219,14 @@
           <w:lang w:val="en-US"/>
         </w:rPr>
       </w:pPr>
+    </w:p>
+    <w:p>
+      <w:pPr>
+        <w:rPr>
+          <w:sz w:val="28"/>
+          <w:lang w:val="en-US"/>
+        </w:rPr>
+      </w:pPr>
       <w:r>
         <w:rPr>
           <w:sz w:val="28"/>
@@ -1248,6 +1268,7 @@
       </w:pPr>
       <w:r>
         <w:rPr>
+          <w:noProof/>
           <w:sz w:val="28"/>
           <w:lang w:val="en-US"/>
         </w:rPr>
@@ -1303,6 +1324,7 @@
       </w:r>
       <w:r>
         <w:rPr>
+          <w:noProof/>
           <w:sz w:val="28"/>
           <w:lang w:val="en-US"/>
         </w:rPr>
@@ -1367,6 +1389,7 @@
       </w:pPr>
       <w:r>
         <w:rPr>
+          <w:noProof/>
           <w:sz w:val="28"/>
           <w:lang w:val="en-US"/>
         </w:rPr>
@@ -1422,6 +1445,7 @@
       </w:r>
       <w:r>
         <w:rPr>
+          <w:noProof/>
           <w:sz w:val="28"/>
           <w:lang w:val="en-US"/>
         </w:rPr>
@@ -1487,6 +1511,7 @@
       </w:pPr>
       <w:r>
         <w:rPr>
+          <w:noProof/>
           <w:sz w:val="28"/>
           <w:lang w:val="en-US"/>
         </w:rPr>
@@ -1536,6 +1561,7 @@
       </w:pPr>
       <w:r>
         <w:rPr>
+          <w:noProof/>
           <w:sz w:val="28"/>
           <w:lang w:val="en-US"/>
         </w:rPr>
@@ -1576,11 +1602,1702 @@
         </w:drawing>
       </w:r>
     </w:p>
+    <w:p>
+      <w:pPr>
+        <w:rPr>
+          <w:sz w:val="28"/>
+          <w:lang w:val="en-US"/>
+        </w:rPr>
+      </w:pPr>
+    </w:p>
+    <w:p>
+      <w:pPr>
+        <w:rPr>
+          <w:sz w:val="28"/>
+          <w:lang w:val="en-US"/>
+        </w:rPr>
+      </w:pPr>
+    </w:p>
+    <w:p>
+      <w:pPr>
+        <w:jc w:val="center"/>
+        <w:rPr>
+          <w:b/>
+          <w:sz w:val="40"/>
+          <w:lang w:val="en-US"/>
+        </w:rPr>
+      </w:pPr>
+    </w:p>
+    <w:p>
+      <w:pPr>
+        <w:jc w:val="center"/>
+        <w:rPr>
+          <w:b/>
+          <w:sz w:val="40"/>
+          <w:lang w:val="en-US"/>
+        </w:rPr>
+      </w:pPr>
+    </w:p>
+    <w:p>
+      <w:pPr>
+        <w:jc w:val="center"/>
+        <w:rPr>
+          <w:b/>
+          <w:sz w:val="40"/>
+          <w:lang w:val="en-US"/>
+        </w:rPr>
+      </w:pPr>
+      <w:r>
+        <w:rPr>
+          <w:b/>
+          <w:sz w:val="40"/>
+          <w:lang w:val="en-US"/>
+        </w:rPr>
+        <w:t xml:space="preserve">Practical No: </w:t>
+      </w:r>
+      <w:r>
+        <w:rPr>
+          <w:b/>
+          <w:sz w:val="40"/>
+          <w:lang w:val="en-US"/>
+        </w:rPr>
+        <w:t>2</w:t>
+      </w:r>
+    </w:p>
+    <w:p>
+      <w:pPr>
+        <w:pStyle w:val="ListParagraph"/>
+        <w:numPr>
+          <w:ilvl w:val="0"/>
+          <w:numId w:val="2"/>
+        </w:numPr>
+        <w:rPr>
+          <w:sz w:val="28"/>
+          <w:lang w:val="en-US"/>
+        </w:rPr>
+      </w:pPr>
+      <w:r>
+        <w:rPr>
+          <w:b/>
+          <w:sz w:val="28"/>
+          <w:lang w:val="en-US"/>
+        </w:rPr>
+        <w:t>Aim</w:t>
+      </w:r>
+      <w:r>
+        <w:rPr>
+          <w:sz w:val="28"/>
+          <w:lang w:val="en-US"/>
+        </w:rPr>
+        <w:t>: Write a program to implement predefined packages (</w:t>
+      </w:r>
+      <w:proofErr w:type="spellStart"/>
+      <w:proofErr w:type="gramStart"/>
+      <w:r>
+        <w:rPr>
+          <w:sz w:val="28"/>
+          <w:lang w:val="en-US"/>
+        </w:rPr>
+        <w:t>java.util</w:t>
+      </w:r>
+      <w:proofErr w:type="spellEnd"/>
+      <w:proofErr w:type="gramEnd"/>
+      <w:r>
+        <w:rPr>
+          <w:sz w:val="28"/>
+          <w:lang w:val="en-US"/>
+        </w:rPr>
+        <w:t>, java.io, etc.).</w:t>
+      </w:r>
+    </w:p>
+    <w:p>
+      <w:pPr>
+        <w:pStyle w:val="ListParagraph"/>
+        <w:numPr>
+          <w:ilvl w:val="0"/>
+          <w:numId w:val="4"/>
+        </w:numPr>
+        <w:rPr>
+          <w:sz w:val="28"/>
+          <w:lang w:val="en-US"/>
+        </w:rPr>
+      </w:pPr>
+      <w:r>
+        <w:rPr>
+          <w:sz w:val="28"/>
+          <w:lang w:val="en-US"/>
+        </w:rPr>
+        <w:t xml:space="preserve">Using </w:t>
+      </w:r>
+      <w:proofErr w:type="spellStart"/>
+      <w:proofErr w:type="gramStart"/>
+      <w:r>
+        <w:rPr>
+          <w:sz w:val="28"/>
+          <w:lang w:val="en-US"/>
+        </w:rPr>
+        <w:t>java.util</w:t>
+      </w:r>
+      <w:proofErr w:type="gramEnd"/>
+      <w:r>
+        <w:rPr>
+          <w:sz w:val="28"/>
+          <w:lang w:val="en-US"/>
+        </w:rPr>
+        <w:t>.Scanner</w:t>
+      </w:r>
+      <w:proofErr w:type="spellEnd"/>
+      <w:r>
+        <w:rPr>
+          <w:sz w:val="28"/>
+          <w:lang w:val="en-US"/>
+        </w:rPr>
+        <w:t xml:space="preserve"> for input:-</w:t>
+      </w:r>
+    </w:p>
+    <w:p>
+      <w:pPr>
+        <w:pStyle w:val="ListParagraph"/>
+        <w:ind w:left="1080"/>
+        <w:rPr>
+          <w:sz w:val="28"/>
+          <w:lang w:val="en-US"/>
+        </w:rPr>
+      </w:pPr>
+      <w:r>
+        <w:rPr>
+          <w:sz w:val="28"/>
+          <w:lang w:val="en-US"/>
+        </w:rPr>
+        <w:drawing>
+          <wp:inline distT="0" distB="0" distL="0" distR="0" wp14:anchorId="373C57C0" wp14:editId="1DB39135">
+            <wp:extent cx="4127500" cy="1895997"/>
+            <wp:effectExtent l="0" t="0" r="6350" b="9525"/>
+            <wp:docPr id="6" name="Picture 6"/>
+            <wp:cNvGraphicFramePr>
+              <a:graphicFrameLocks xmlns:a="http://schemas.openxmlformats.org/drawingml/2006/main" noChangeAspect="1"/>
+            </wp:cNvGraphicFramePr>
+            <a:graphic xmlns:a="http://schemas.openxmlformats.org/drawingml/2006/main">
+              <a:graphicData uri="http://schemas.openxmlformats.org/drawingml/2006/picture">
+                <pic:pic xmlns:pic="http://schemas.openxmlformats.org/drawingml/2006/picture">
+                  <pic:nvPicPr>
+                    <pic:cNvPr id="1" name=""/>
+                    <pic:cNvPicPr/>
+                  </pic:nvPicPr>
+                  <pic:blipFill>
+                    <a:blip r:embed="rId29"/>
+                    <a:stretch>
+                      <a:fillRect/>
+                    </a:stretch>
+                  </pic:blipFill>
+                  <pic:spPr>
+                    <a:xfrm>
+                      <a:off x="0" y="0"/>
+                      <a:ext cx="4141985" cy="1902651"/>
+                    </a:xfrm>
+                    <a:prstGeom prst="rect">
+                      <a:avLst/>
+                    </a:prstGeom>
+                  </pic:spPr>
+                </pic:pic>
+              </a:graphicData>
+            </a:graphic>
+          </wp:inline>
+        </w:drawing>
+      </w:r>
+    </w:p>
+    <w:p>
+      <w:pPr>
+        <w:pStyle w:val="ListParagraph"/>
+        <w:ind w:left="1080"/>
+        <w:rPr>
+          <w:sz w:val="28"/>
+          <w:lang w:val="en-US"/>
+        </w:rPr>
+      </w:pPr>
+      <w:r>
+        <w:rPr>
+          <w:sz w:val="28"/>
+          <w:lang w:val="en-US"/>
+        </w:rPr>
+        <w:drawing>
+          <wp:inline distT="0" distB="0" distL="0" distR="0" wp14:anchorId="20AF6777" wp14:editId="15DF1330">
+            <wp:extent cx="2219635" cy="619211"/>
+            <wp:effectExtent l="0" t="0" r="9525" b="9525"/>
+            <wp:docPr id="24" name="Picture 24"/>
+            <wp:cNvGraphicFramePr>
+              <a:graphicFrameLocks xmlns:a="http://schemas.openxmlformats.org/drawingml/2006/main" noChangeAspect="1"/>
+            </wp:cNvGraphicFramePr>
+            <a:graphic xmlns:a="http://schemas.openxmlformats.org/drawingml/2006/main">
+              <a:graphicData uri="http://schemas.openxmlformats.org/drawingml/2006/picture">
+                <pic:pic xmlns:pic="http://schemas.openxmlformats.org/drawingml/2006/picture">
+                  <pic:nvPicPr>
+                    <pic:cNvPr id="1" name=""/>
+                    <pic:cNvPicPr/>
+                  </pic:nvPicPr>
+                  <pic:blipFill>
+                    <a:blip r:embed="rId30"/>
+                    <a:stretch>
+                      <a:fillRect/>
+                    </a:stretch>
+                  </pic:blipFill>
+                  <pic:spPr>
+                    <a:xfrm>
+                      <a:off x="0" y="0"/>
+                      <a:ext cx="2219635" cy="619211"/>
+                    </a:xfrm>
+                    <a:prstGeom prst="rect">
+                      <a:avLst/>
+                    </a:prstGeom>
+                  </pic:spPr>
+                </pic:pic>
+              </a:graphicData>
+            </a:graphic>
+          </wp:inline>
+        </w:drawing>
+      </w:r>
+    </w:p>
+    <w:p>
+      <w:pPr>
+        <w:pStyle w:val="ListParagraph"/>
+        <w:numPr>
+          <w:ilvl w:val="0"/>
+          <w:numId w:val="4"/>
+        </w:numPr>
+        <w:rPr>
+          <w:sz w:val="28"/>
+          <w:lang w:val="en-US"/>
+        </w:rPr>
+      </w:pPr>
+      <w:r>
+        <w:rPr>
+          <w:sz w:val="28"/>
+          <w:lang w:val="en-US"/>
+        </w:rPr>
+        <w:t xml:space="preserve">Using </w:t>
+      </w:r>
+      <w:proofErr w:type="spellStart"/>
+      <w:proofErr w:type="gramStart"/>
+      <w:r>
+        <w:rPr>
+          <w:sz w:val="28"/>
+          <w:lang w:val="en-US"/>
+        </w:rPr>
+        <w:t>java.lang</w:t>
+      </w:r>
+      <w:proofErr w:type="gramEnd"/>
+      <w:r>
+        <w:rPr>
+          <w:sz w:val="28"/>
+          <w:lang w:val="en-US"/>
+        </w:rPr>
+        <w:t>.Math</w:t>
+      </w:r>
+      <w:proofErr w:type="spellEnd"/>
+      <w:r>
+        <w:rPr>
+          <w:sz w:val="28"/>
+          <w:lang w:val="en-US"/>
+        </w:rPr>
+        <w:t xml:space="preserve"> for Calculation:-</w:t>
+      </w:r>
+    </w:p>
+    <w:p>
+      <w:pPr>
+        <w:pStyle w:val="ListParagraph"/>
+        <w:ind w:left="1080"/>
+        <w:rPr>
+          <w:sz w:val="28"/>
+          <w:lang w:val="en-US"/>
+        </w:rPr>
+      </w:pPr>
+      <w:r>
+        <w:rPr>
+          <w:sz w:val="28"/>
+          <w:lang w:val="en-US"/>
+        </w:rPr>
+        <w:drawing>
+          <wp:inline distT="0" distB="0" distL="0" distR="0" wp14:anchorId="0D3F61D6" wp14:editId="06387271">
+            <wp:extent cx="4718050" cy="2149855"/>
+            <wp:effectExtent l="0" t="0" r="6350" b="3175"/>
+            <wp:docPr id="26" name="Picture 26"/>
+            <wp:cNvGraphicFramePr>
+              <a:graphicFrameLocks xmlns:a="http://schemas.openxmlformats.org/drawingml/2006/main" noChangeAspect="1"/>
+            </wp:cNvGraphicFramePr>
+            <a:graphic xmlns:a="http://schemas.openxmlformats.org/drawingml/2006/main">
+              <a:graphicData uri="http://schemas.openxmlformats.org/drawingml/2006/picture">
+                <pic:pic xmlns:pic="http://schemas.openxmlformats.org/drawingml/2006/picture">
+                  <pic:nvPicPr>
+                    <pic:cNvPr id="1" name=""/>
+                    <pic:cNvPicPr/>
+                  </pic:nvPicPr>
+                  <pic:blipFill>
+                    <a:blip r:embed="rId31"/>
+                    <a:stretch>
+                      <a:fillRect/>
+                    </a:stretch>
+                  </pic:blipFill>
+                  <pic:spPr>
+                    <a:xfrm>
+                      <a:off x="0" y="0"/>
+                      <a:ext cx="4736940" cy="2158463"/>
+                    </a:xfrm>
+                    <a:prstGeom prst="rect">
+                      <a:avLst/>
+                    </a:prstGeom>
+                  </pic:spPr>
+                </pic:pic>
+              </a:graphicData>
+            </a:graphic>
+          </wp:inline>
+        </w:drawing>
+      </w:r>
+    </w:p>
+    <w:p>
+      <w:pPr>
+        <w:pStyle w:val="ListParagraph"/>
+        <w:ind w:left="1080"/>
+        <w:rPr>
+          <w:sz w:val="28"/>
+          <w:lang w:val="en-US"/>
+        </w:rPr>
+      </w:pPr>
+      <w:r>
+        <w:rPr>
+          <w:sz w:val="28"/>
+          <w:lang w:val="en-US"/>
+        </w:rPr>
+        <w:drawing>
+          <wp:inline distT="0" distB="0" distL="0" distR="0" wp14:anchorId="665B77AF" wp14:editId="12703851">
+            <wp:extent cx="3486637" cy="1086002"/>
+            <wp:effectExtent l="0" t="0" r="0" b="0"/>
+            <wp:docPr id="27" name="Picture 27"/>
+            <wp:cNvGraphicFramePr>
+              <a:graphicFrameLocks xmlns:a="http://schemas.openxmlformats.org/drawingml/2006/main" noChangeAspect="1"/>
+            </wp:cNvGraphicFramePr>
+            <a:graphic xmlns:a="http://schemas.openxmlformats.org/drawingml/2006/main">
+              <a:graphicData uri="http://schemas.openxmlformats.org/drawingml/2006/picture">
+                <pic:pic xmlns:pic="http://schemas.openxmlformats.org/drawingml/2006/picture">
+                  <pic:nvPicPr>
+                    <pic:cNvPr id="1" name=""/>
+                    <pic:cNvPicPr/>
+                  </pic:nvPicPr>
+                  <pic:blipFill>
+                    <a:blip r:embed="rId32"/>
+                    <a:stretch>
+                      <a:fillRect/>
+                    </a:stretch>
+                  </pic:blipFill>
+                  <pic:spPr>
+                    <a:xfrm>
+                      <a:off x="0" y="0"/>
+                      <a:ext cx="3486637" cy="1086002"/>
+                    </a:xfrm>
+                    <a:prstGeom prst="rect">
+                      <a:avLst/>
+                    </a:prstGeom>
+                  </pic:spPr>
+                </pic:pic>
+              </a:graphicData>
+            </a:graphic>
+          </wp:inline>
+        </w:drawing>
+      </w:r>
+    </w:p>
+    <w:p>
+      <w:pPr>
+        <w:pStyle w:val="ListParagraph"/>
+        <w:numPr>
+          <w:ilvl w:val="0"/>
+          <w:numId w:val="4"/>
+        </w:numPr>
+        <w:rPr>
+          <w:sz w:val="28"/>
+          <w:lang w:val="en-US"/>
+        </w:rPr>
+      </w:pPr>
+      <w:r>
+        <w:rPr>
+          <w:sz w:val="28"/>
+          <w:lang w:val="en-US"/>
+        </w:rPr>
+        <w:lastRenderedPageBreak/>
+        <w:t xml:space="preserve">Using </w:t>
+      </w:r>
+      <w:proofErr w:type="spellStart"/>
+      <w:proofErr w:type="gramStart"/>
+      <w:r>
+        <w:rPr>
+          <w:sz w:val="28"/>
+          <w:lang w:val="en-US"/>
+        </w:rPr>
+        <w:t>java.time</w:t>
+      </w:r>
+      <w:proofErr w:type="gramEnd"/>
+      <w:r>
+        <w:rPr>
+          <w:sz w:val="28"/>
+          <w:lang w:val="en-US"/>
+        </w:rPr>
+        <w:t>.LocalDate</w:t>
+      </w:r>
+      <w:proofErr w:type="spellEnd"/>
+      <w:r>
+        <w:rPr>
+          <w:sz w:val="28"/>
+          <w:lang w:val="en-US"/>
+        </w:rPr>
+        <w:t xml:space="preserve"> for time:-</w:t>
+      </w:r>
+      <w:r>
+        <w:rPr>
+          <w:sz w:val="28"/>
+          <w:lang w:val="en-US"/>
+        </w:rPr>
+        <w:t xml:space="preserve"> </w:t>
+      </w:r>
+      <w:r>
+        <w:rPr>
+          <w:sz w:val="28"/>
+          <w:lang w:val="en-US"/>
+        </w:rPr>
+        <w:drawing>
+          <wp:inline distT="0" distB="0" distL="0" distR="0" wp14:anchorId="4A396DBA" wp14:editId="18334E71">
+            <wp:extent cx="4019550" cy="1607820"/>
+            <wp:effectExtent l="0" t="0" r="0" b="0"/>
+            <wp:docPr id="28" name="Picture 28"/>
+            <wp:cNvGraphicFramePr>
+              <a:graphicFrameLocks xmlns:a="http://schemas.openxmlformats.org/drawingml/2006/main" noChangeAspect="1"/>
+            </wp:cNvGraphicFramePr>
+            <a:graphic xmlns:a="http://schemas.openxmlformats.org/drawingml/2006/main">
+              <a:graphicData uri="http://schemas.openxmlformats.org/drawingml/2006/picture">
+                <pic:pic xmlns:pic="http://schemas.openxmlformats.org/drawingml/2006/picture">
+                  <pic:nvPicPr>
+                    <pic:cNvPr id="1" name=""/>
+                    <pic:cNvPicPr/>
+                  </pic:nvPicPr>
+                  <pic:blipFill>
+                    <a:blip r:embed="rId33">
+                      <a:extLst>
+                        <a:ext uri="{28A0092B-C50C-407E-A947-70E740481C1C}">
+                          <a14:useLocalDpi xmlns:a14="http://schemas.microsoft.com/office/drawing/2010/main" val="0"/>
+                        </a:ext>
+                      </a:extLst>
+                    </a:blip>
+                    <a:stretch>
+                      <a:fillRect/>
+                    </a:stretch>
+                  </pic:blipFill>
+                  <pic:spPr>
+                    <a:xfrm>
+                      <a:off x="0" y="0"/>
+                      <a:ext cx="4019550" cy="1607820"/>
+                    </a:xfrm>
+                    <a:prstGeom prst="rect">
+                      <a:avLst/>
+                    </a:prstGeom>
+                  </pic:spPr>
+                </pic:pic>
+              </a:graphicData>
+            </a:graphic>
+          </wp:inline>
+        </w:drawing>
+      </w:r>
+    </w:p>
+    <w:p>
+      <w:pPr>
+        <w:pStyle w:val="ListParagraph"/>
+        <w:ind w:left="1080"/>
+        <w:rPr>
+          <w:sz w:val="28"/>
+          <w:lang w:val="en-US"/>
+        </w:rPr>
+      </w:pPr>
+      <w:r>
+        <w:rPr>
+          <w:sz w:val="28"/>
+          <w:lang w:val="en-US"/>
+        </w:rPr>
+        <w:drawing>
+          <wp:inline distT="0" distB="0" distL="0" distR="0" wp14:anchorId="7BFAD796" wp14:editId="0B50F69F">
+            <wp:extent cx="2012950" cy="464527"/>
+            <wp:effectExtent l="0" t="0" r="6350" b="0"/>
+            <wp:docPr id="29" name="Picture 29"/>
+            <wp:cNvGraphicFramePr>
+              <a:graphicFrameLocks xmlns:a="http://schemas.openxmlformats.org/drawingml/2006/main" noChangeAspect="1"/>
+            </wp:cNvGraphicFramePr>
+            <a:graphic xmlns:a="http://schemas.openxmlformats.org/drawingml/2006/main">
+              <a:graphicData uri="http://schemas.openxmlformats.org/drawingml/2006/picture">
+                <pic:pic xmlns:pic="http://schemas.openxmlformats.org/drawingml/2006/picture">
+                  <pic:nvPicPr>
+                    <pic:cNvPr id="1" name=""/>
+                    <pic:cNvPicPr/>
+                  </pic:nvPicPr>
+                  <pic:blipFill>
+                    <a:blip r:embed="rId34"/>
+                    <a:stretch>
+                      <a:fillRect/>
+                    </a:stretch>
+                  </pic:blipFill>
+                  <pic:spPr>
+                    <a:xfrm>
+                      <a:off x="0" y="0"/>
+                      <a:ext cx="2017915" cy="465673"/>
+                    </a:xfrm>
+                    <a:prstGeom prst="rect">
+                      <a:avLst/>
+                    </a:prstGeom>
+                  </pic:spPr>
+                </pic:pic>
+              </a:graphicData>
+            </a:graphic>
+          </wp:inline>
+        </w:drawing>
+      </w:r>
+    </w:p>
+    <w:p>
+      <w:pPr>
+        <w:pStyle w:val="ListParagraph"/>
+        <w:numPr>
+          <w:ilvl w:val="0"/>
+          <w:numId w:val="4"/>
+        </w:numPr>
+        <w:rPr>
+          <w:sz w:val="28"/>
+          <w:lang w:val="en-US"/>
+        </w:rPr>
+      </w:pPr>
+      <w:r>
+        <w:rPr>
+          <w:sz w:val="28"/>
+          <w:lang w:val="en-US"/>
+        </w:rPr>
+        <w:t xml:space="preserve">Using </w:t>
+      </w:r>
+      <w:proofErr w:type="spellStart"/>
+      <w:proofErr w:type="gramStart"/>
+      <w:r>
+        <w:rPr>
+          <w:sz w:val="28"/>
+          <w:lang w:val="en-US"/>
+        </w:rPr>
+        <w:t>java.io.File</w:t>
+      </w:r>
+      <w:proofErr w:type="spellEnd"/>
+      <w:proofErr w:type="gramEnd"/>
+      <w:r>
+        <w:rPr>
+          <w:sz w:val="28"/>
+          <w:lang w:val="en-US"/>
+        </w:rPr>
+        <w:t xml:space="preserve">:- </w:t>
+      </w:r>
+    </w:p>
+    <w:p>
+      <w:pPr>
+        <w:pStyle w:val="ListParagraph"/>
+        <w:ind w:left="1080"/>
+        <w:rPr>
+          <w:sz w:val="28"/>
+          <w:lang w:val="en-US"/>
+        </w:rPr>
+      </w:pPr>
+      <w:r>
+        <w:rPr>
+          <w:noProof/>
+        </w:rPr>
+        <w:drawing>
+          <wp:inline distT="0" distB="0" distL="0" distR="0" wp14:anchorId="56CF293A" wp14:editId="0454A2A3">
+            <wp:extent cx="4267200" cy="1914561"/>
+            <wp:effectExtent l="0" t="0" r="0" b="9525"/>
+            <wp:docPr id="30" name="Picture 30"/>
+            <wp:cNvGraphicFramePr>
+              <a:graphicFrameLocks xmlns:a="http://schemas.openxmlformats.org/drawingml/2006/main" noChangeAspect="1"/>
+            </wp:cNvGraphicFramePr>
+            <a:graphic xmlns:a="http://schemas.openxmlformats.org/drawingml/2006/main">
+              <a:graphicData uri="http://schemas.openxmlformats.org/drawingml/2006/picture">
+                <pic:pic xmlns:pic="http://schemas.openxmlformats.org/drawingml/2006/picture">
+                  <pic:nvPicPr>
+                    <pic:cNvPr id="1" name=""/>
+                    <pic:cNvPicPr/>
+                  </pic:nvPicPr>
+                  <pic:blipFill>
+                    <a:blip r:embed="rId35"/>
+                    <a:stretch>
+                      <a:fillRect/>
+                    </a:stretch>
+                  </pic:blipFill>
+                  <pic:spPr>
+                    <a:xfrm>
+                      <a:off x="0" y="0"/>
+                      <a:ext cx="4273392" cy="1917339"/>
+                    </a:xfrm>
+                    <a:prstGeom prst="rect">
+                      <a:avLst/>
+                    </a:prstGeom>
+                  </pic:spPr>
+                </pic:pic>
+              </a:graphicData>
+            </a:graphic>
+          </wp:inline>
+        </w:drawing>
+      </w:r>
+    </w:p>
+    <w:p>
+      <w:pPr>
+        <w:pStyle w:val="ListParagraph"/>
+        <w:ind w:left="1080"/>
+        <w:rPr>
+          <w:sz w:val="28"/>
+          <w:lang w:val="en-US"/>
+        </w:rPr>
+      </w:pPr>
+      <w:r>
+        <w:rPr>
+          <w:noProof/>
+        </w:rPr>
+        <w:drawing>
+          <wp:inline distT="0" distB="0" distL="0" distR="0" wp14:anchorId="5D42B5E9" wp14:editId="6349955E">
+            <wp:extent cx="1276190" cy="466667"/>
+            <wp:effectExtent l="0" t="0" r="635" b="0"/>
+            <wp:docPr id="31" name="Picture 31"/>
+            <wp:cNvGraphicFramePr>
+              <a:graphicFrameLocks xmlns:a="http://schemas.openxmlformats.org/drawingml/2006/main" noChangeAspect="1"/>
+            </wp:cNvGraphicFramePr>
+            <a:graphic xmlns:a="http://schemas.openxmlformats.org/drawingml/2006/main">
+              <a:graphicData uri="http://schemas.openxmlformats.org/drawingml/2006/picture">
+                <pic:pic xmlns:pic="http://schemas.openxmlformats.org/drawingml/2006/picture">
+                  <pic:nvPicPr>
+                    <pic:cNvPr id="1" name=""/>
+                    <pic:cNvPicPr/>
+                  </pic:nvPicPr>
+                  <pic:blipFill>
+                    <a:blip r:embed="rId36"/>
+                    <a:stretch>
+                      <a:fillRect/>
+                    </a:stretch>
+                  </pic:blipFill>
+                  <pic:spPr>
+                    <a:xfrm>
+                      <a:off x="0" y="0"/>
+                      <a:ext cx="1276190" cy="466667"/>
+                    </a:xfrm>
+                    <a:prstGeom prst="rect">
+                      <a:avLst/>
+                    </a:prstGeom>
+                  </pic:spPr>
+                </pic:pic>
+              </a:graphicData>
+            </a:graphic>
+          </wp:inline>
+        </w:drawing>
+      </w:r>
+    </w:p>
+    <w:p>
+      <w:pPr>
+        <w:pStyle w:val="ListParagraph"/>
+        <w:numPr>
+          <w:ilvl w:val="0"/>
+          <w:numId w:val="4"/>
+        </w:numPr>
+        <w:rPr>
+          <w:sz w:val="28"/>
+          <w:lang w:val="en-US"/>
+        </w:rPr>
+      </w:pPr>
+      <w:r>
+        <w:rPr>
+          <w:sz w:val="28"/>
+          <w:lang w:val="en-US"/>
+        </w:rPr>
+        <w:t xml:space="preserve">Using java.net.URL for </w:t>
+      </w:r>
+      <w:hyperlink r:id="rId37" w:history="1">
+        <w:r>
+          <w:rPr>
+            <w:rStyle w:val="Hyperlink"/>
+            <w:sz w:val="28"/>
+            <w:lang w:val="en-US"/>
+          </w:rPr>
+          <w:t>URL:-</w:t>
+        </w:r>
+      </w:hyperlink>
+    </w:p>
+    <w:p>
+      <w:pPr>
+        <w:pStyle w:val="ListParagraph"/>
+        <w:ind w:left="1080"/>
+        <w:rPr>
+          <w:sz w:val="28"/>
+          <w:lang w:val="en-US"/>
+        </w:rPr>
+      </w:pPr>
+      <w:r>
+        <w:rPr>
+          <w:sz w:val="28"/>
+          <w:lang w:val="en-US"/>
+        </w:rPr>
+        <w:drawing>
+          <wp:inline distT="0" distB="0" distL="0" distR="0" wp14:anchorId="4B107582" wp14:editId="689F9A38">
+            <wp:extent cx="3952875" cy="1847794"/>
+            <wp:effectExtent l="0" t="0" r="0" b="635"/>
+            <wp:docPr id="32" name="Picture 32"/>
+            <wp:cNvGraphicFramePr>
+              <a:graphicFrameLocks xmlns:a="http://schemas.openxmlformats.org/drawingml/2006/main" noChangeAspect="1"/>
+            </wp:cNvGraphicFramePr>
+            <a:graphic xmlns:a="http://schemas.openxmlformats.org/drawingml/2006/main">
+              <a:graphicData uri="http://schemas.openxmlformats.org/drawingml/2006/picture">
+                <pic:pic xmlns:pic="http://schemas.openxmlformats.org/drawingml/2006/picture">
+                  <pic:nvPicPr>
+                    <pic:cNvPr id="1" name=""/>
+                    <pic:cNvPicPr/>
+                  </pic:nvPicPr>
+                  <pic:blipFill>
+                    <a:blip r:embed="rId38"/>
+                    <a:stretch>
+                      <a:fillRect/>
+                    </a:stretch>
+                  </pic:blipFill>
+                  <pic:spPr>
+                    <a:xfrm>
+                      <a:off x="0" y="0"/>
+                      <a:ext cx="3970279" cy="1855930"/>
+                    </a:xfrm>
+                    <a:prstGeom prst="rect">
+                      <a:avLst/>
+                    </a:prstGeom>
+                  </pic:spPr>
+                </pic:pic>
+              </a:graphicData>
+            </a:graphic>
+          </wp:inline>
+        </w:drawing>
+      </w:r>
+    </w:p>
+    <w:p>
+      <w:pPr>
+        <w:pStyle w:val="ListParagraph"/>
+        <w:ind w:left="1080"/>
+        <w:rPr>
+          <w:sz w:val="28"/>
+          <w:lang w:val="en-US"/>
+        </w:rPr>
+      </w:pPr>
+      <w:r>
+        <w:rPr>
+          <w:sz w:val="28"/>
+          <w:lang w:val="en-US"/>
+        </w:rPr>
+        <w:drawing>
+          <wp:inline distT="0" distB="0" distL="0" distR="0" wp14:anchorId="647A969C" wp14:editId="7D3EB951">
+            <wp:extent cx="1060450" cy="469729"/>
+            <wp:effectExtent l="0" t="0" r="6350" b="6985"/>
+            <wp:docPr id="33" name="Picture 33"/>
+            <wp:cNvGraphicFramePr>
+              <a:graphicFrameLocks xmlns:a="http://schemas.openxmlformats.org/drawingml/2006/main" noChangeAspect="1"/>
+            </wp:cNvGraphicFramePr>
+            <a:graphic xmlns:a="http://schemas.openxmlformats.org/drawingml/2006/main">
+              <a:graphicData uri="http://schemas.openxmlformats.org/drawingml/2006/picture">
+                <pic:pic xmlns:pic="http://schemas.openxmlformats.org/drawingml/2006/picture">
+                  <pic:nvPicPr>
+                    <pic:cNvPr id="1" name=""/>
+                    <pic:cNvPicPr/>
+                  </pic:nvPicPr>
+                  <pic:blipFill>
+                    <a:blip r:embed="rId39"/>
+                    <a:stretch>
+                      <a:fillRect/>
+                    </a:stretch>
+                  </pic:blipFill>
+                  <pic:spPr>
+                    <a:xfrm>
+                      <a:off x="0" y="0"/>
+                      <a:ext cx="1068621" cy="473349"/>
+                    </a:xfrm>
+                    <a:prstGeom prst="rect">
+                      <a:avLst/>
+                    </a:prstGeom>
+                  </pic:spPr>
+                </pic:pic>
+              </a:graphicData>
+            </a:graphic>
+          </wp:inline>
+        </w:drawing>
+      </w:r>
+    </w:p>
+    <w:p>
+      <w:pPr>
+        <w:rPr>
+          <w:sz w:val="28"/>
+          <w:highlight w:val="lightGray"/>
+          <w:lang w:val="en-US"/>
+        </w:rPr>
+      </w:pPr>
+      <w:r>
+        <w:rPr>
+          <w:sz w:val="28"/>
+          <w:highlight w:val="lightGray"/>
+          <w:lang w:val="en-US"/>
+        </w:rPr>
+        <w:br w:type="page"/>
+      </w:r>
+    </w:p>
+    <w:p>
+      <w:pPr>
+        <w:pStyle w:val="ListParagraph"/>
+        <w:numPr>
+          <w:ilvl w:val="0"/>
+          <w:numId w:val="4"/>
+        </w:numPr>
+        <w:rPr>
+          <w:sz w:val="28"/>
+          <w:lang w:val="en-US"/>
+        </w:rPr>
+      </w:pPr>
+      <w:r>
+        <w:rPr>
+          <w:sz w:val="28"/>
+          <w:lang w:val="en-US"/>
+        </w:rPr>
+        <w:lastRenderedPageBreak/>
+        <w:t xml:space="preserve">Using </w:t>
+      </w:r>
+      <w:proofErr w:type="spellStart"/>
+      <w:proofErr w:type="gramStart"/>
+      <w:r>
+        <w:rPr>
+          <w:sz w:val="28"/>
+          <w:lang w:val="en-US"/>
+        </w:rPr>
+        <w:t>java.security</w:t>
+      </w:r>
+      <w:proofErr w:type="spellEnd"/>
+      <w:proofErr w:type="gramEnd"/>
+      <w:r>
+        <w:rPr>
+          <w:sz w:val="28"/>
+          <w:lang w:val="en-US"/>
+        </w:rPr>
+        <w:t>;-</w:t>
+      </w:r>
+    </w:p>
+    <w:p>
+      <w:pPr>
+        <w:pStyle w:val="ListParagraph"/>
+        <w:ind w:left="1080"/>
+        <w:rPr>
+          <w:sz w:val="28"/>
+          <w:lang w:val="en-US"/>
+        </w:rPr>
+      </w:pPr>
+      <w:r>
+        <w:rPr>
+          <w:sz w:val="28"/>
+          <w:lang w:val="en-US"/>
+        </w:rPr>
+        <w:drawing>
+          <wp:inline distT="0" distB="0" distL="0" distR="0" wp14:anchorId="1F05CB72" wp14:editId="22B58B5C">
+            <wp:extent cx="4597399" cy="2554948"/>
+            <wp:effectExtent l="0" t="0" r="0" b="0"/>
+            <wp:docPr id="34" name="Picture 34"/>
+            <wp:cNvGraphicFramePr>
+              <a:graphicFrameLocks xmlns:a="http://schemas.openxmlformats.org/drawingml/2006/main" noChangeAspect="1"/>
+            </wp:cNvGraphicFramePr>
+            <a:graphic xmlns:a="http://schemas.openxmlformats.org/drawingml/2006/main">
+              <a:graphicData uri="http://schemas.openxmlformats.org/drawingml/2006/picture">
+                <pic:pic xmlns:pic="http://schemas.openxmlformats.org/drawingml/2006/picture">
+                  <pic:nvPicPr>
+                    <pic:cNvPr id="1" name=""/>
+                    <pic:cNvPicPr/>
+                  </pic:nvPicPr>
+                  <pic:blipFill>
+                    <a:blip r:embed="rId40"/>
+                    <a:stretch>
+                      <a:fillRect/>
+                    </a:stretch>
+                  </pic:blipFill>
+                  <pic:spPr>
+                    <a:xfrm>
+                      <a:off x="0" y="0"/>
+                      <a:ext cx="4620522" cy="2567798"/>
+                    </a:xfrm>
+                    <a:prstGeom prst="rect">
+                      <a:avLst/>
+                    </a:prstGeom>
+                  </pic:spPr>
+                </pic:pic>
+              </a:graphicData>
+            </a:graphic>
+          </wp:inline>
+        </w:drawing>
+      </w:r>
+    </w:p>
+    <w:p>
+      <w:pPr>
+        <w:pStyle w:val="ListParagraph"/>
+        <w:ind w:left="1080"/>
+        <w:rPr>
+          <w:sz w:val="28"/>
+          <w:lang w:val="en-US"/>
+        </w:rPr>
+      </w:pPr>
+      <w:r>
+        <w:rPr>
+          <w:sz w:val="28"/>
+          <w:lang w:val="en-US"/>
+        </w:rPr>
+        <w:drawing>
+          <wp:inline distT="0" distB="0" distL="0" distR="0" wp14:anchorId="5CF7DC0B" wp14:editId="21CA90D8">
+            <wp:extent cx="4860927" cy="372747"/>
+            <wp:effectExtent l="0" t="0" r="0" b="8255"/>
+            <wp:docPr id="35" name="Picture 35"/>
+            <wp:cNvGraphicFramePr>
+              <a:graphicFrameLocks xmlns:a="http://schemas.openxmlformats.org/drawingml/2006/main" noChangeAspect="1"/>
+            </wp:cNvGraphicFramePr>
+            <a:graphic xmlns:a="http://schemas.openxmlformats.org/drawingml/2006/main">
+              <a:graphicData uri="http://schemas.openxmlformats.org/drawingml/2006/picture">
+                <pic:pic xmlns:pic="http://schemas.openxmlformats.org/drawingml/2006/picture">
+                  <pic:nvPicPr>
+                    <pic:cNvPr id="1" name=""/>
+                    <pic:cNvPicPr/>
+                  </pic:nvPicPr>
+                  <pic:blipFill>
+                    <a:blip r:embed="rId41"/>
+                    <a:stretch>
+                      <a:fillRect/>
+                    </a:stretch>
+                  </pic:blipFill>
+                  <pic:spPr>
+                    <a:xfrm>
+                      <a:off x="0" y="0"/>
+                      <a:ext cx="5075671" cy="389214"/>
+                    </a:xfrm>
+                    <a:prstGeom prst="rect">
+                      <a:avLst/>
+                    </a:prstGeom>
+                  </pic:spPr>
+                </pic:pic>
+              </a:graphicData>
+            </a:graphic>
+          </wp:inline>
+        </w:drawing>
+      </w:r>
+    </w:p>
+    <w:p>
+      <w:pPr>
+        <w:pStyle w:val="ListParagraph"/>
+        <w:numPr>
+          <w:ilvl w:val="0"/>
+          <w:numId w:val="2"/>
+        </w:numPr>
+        <w:rPr>
+          <w:sz w:val="28"/>
+          <w:lang w:val="en-US"/>
+        </w:rPr>
+      </w:pPr>
+      <w:r>
+        <w:rPr>
+          <w:sz w:val="28"/>
+          <w:lang w:val="en-US"/>
+        </w:rPr>
+        <w:t xml:space="preserve">Write a Program to create and use a user </w:t>
+      </w:r>
+      <w:proofErr w:type="gramStart"/>
+      <w:r>
+        <w:rPr>
+          <w:sz w:val="28"/>
+          <w:lang w:val="en-US"/>
+        </w:rPr>
+        <w:t>defined packages</w:t>
+      </w:r>
+      <w:proofErr w:type="gramEnd"/>
+      <w:r>
+        <w:rPr>
+          <w:sz w:val="28"/>
+          <w:lang w:val="en-US"/>
+        </w:rPr>
+        <w:t>.</w:t>
+      </w:r>
+    </w:p>
+    <w:p>
+      <w:pPr>
+        <w:pStyle w:val="ListParagraph"/>
+        <w:numPr>
+          <w:ilvl w:val="0"/>
+          <w:numId w:val="5"/>
+        </w:numPr>
+        <w:rPr>
+          <w:sz w:val="28"/>
+          <w:lang w:val="en-US"/>
+        </w:rPr>
+      </w:pPr>
+      <w:r>
+        <w:rPr>
+          <w:sz w:val="28"/>
+          <w:lang w:val="en-US"/>
+        </w:rPr>
+        <w:t>Create a package src.myapp.utils.Mathutils.java:</w:t>
+      </w:r>
+    </w:p>
+    <w:p>
+      <w:pPr>
+        <w:pStyle w:val="ListParagraph"/>
+        <w:ind w:left="1080"/>
+        <w:rPr>
+          <w:sz w:val="28"/>
+          <w:lang w:val="en-US"/>
+        </w:rPr>
+      </w:pPr>
+      <w:r>
+        <w:rPr>
+          <w:sz w:val="28"/>
+          <w:lang w:val="en-US"/>
+        </w:rPr>
+        <w:drawing>
+          <wp:inline distT="0" distB="0" distL="0" distR="0" wp14:anchorId="5D98D65A" wp14:editId="729D3EDB">
+            <wp:extent cx="2813050" cy="1629566"/>
+            <wp:effectExtent l="0" t="0" r="6350" b="8890"/>
+            <wp:docPr id="36" name="Picture 36"/>
+            <wp:cNvGraphicFramePr>
+              <a:graphicFrameLocks xmlns:a="http://schemas.openxmlformats.org/drawingml/2006/main" noChangeAspect="1"/>
+            </wp:cNvGraphicFramePr>
+            <a:graphic xmlns:a="http://schemas.openxmlformats.org/drawingml/2006/main">
+              <a:graphicData uri="http://schemas.openxmlformats.org/drawingml/2006/picture">
+                <pic:pic xmlns:pic="http://schemas.openxmlformats.org/drawingml/2006/picture">
+                  <pic:nvPicPr>
+                    <pic:cNvPr id="1" name=""/>
+                    <pic:cNvPicPr/>
+                  </pic:nvPicPr>
+                  <pic:blipFill>
+                    <a:blip r:embed="rId42"/>
+                    <a:stretch>
+                      <a:fillRect/>
+                    </a:stretch>
+                  </pic:blipFill>
+                  <pic:spPr>
+                    <a:xfrm>
+                      <a:off x="0" y="0"/>
+                      <a:ext cx="2816981" cy="1631843"/>
+                    </a:xfrm>
+                    <a:prstGeom prst="rect">
+                      <a:avLst/>
+                    </a:prstGeom>
+                  </pic:spPr>
+                </pic:pic>
+              </a:graphicData>
+            </a:graphic>
+          </wp:inline>
+        </w:drawing>
+      </w:r>
+    </w:p>
+    <w:p>
+      <w:pPr>
+        <w:pStyle w:val="ListParagraph"/>
+        <w:numPr>
+          <w:ilvl w:val="0"/>
+          <w:numId w:val="5"/>
+        </w:numPr>
+        <w:rPr>
+          <w:sz w:val="28"/>
+          <w:lang w:val="en-US"/>
+        </w:rPr>
+      </w:pPr>
+      <w:r>
+        <w:rPr>
+          <w:sz w:val="28"/>
+          <w:lang w:val="en-US"/>
+        </w:rPr>
+        <w:t>Create another file to import packages:</w:t>
+      </w:r>
+    </w:p>
+    <w:p>
+      <w:pPr>
+        <w:pStyle w:val="ListParagraph"/>
+        <w:ind w:left="1080"/>
+        <w:rPr>
+          <w:sz w:val="28"/>
+          <w:lang w:val="en-US"/>
+        </w:rPr>
+      </w:pPr>
+      <w:r>
+        <w:rPr>
+          <w:sz w:val="28"/>
+          <w:lang w:val="en-US"/>
+        </w:rPr>
+        <w:drawing>
+          <wp:inline distT="0" distB="0" distL="0" distR="0" wp14:anchorId="3B843065" wp14:editId="4561FC03">
+            <wp:extent cx="4248150" cy="1228929"/>
+            <wp:effectExtent l="0" t="0" r="0" b="9525"/>
+            <wp:docPr id="37" name="Picture 37"/>
+            <wp:cNvGraphicFramePr>
+              <a:graphicFrameLocks xmlns:a="http://schemas.openxmlformats.org/drawingml/2006/main" noChangeAspect="1"/>
+            </wp:cNvGraphicFramePr>
+            <a:graphic xmlns:a="http://schemas.openxmlformats.org/drawingml/2006/main">
+              <a:graphicData uri="http://schemas.openxmlformats.org/drawingml/2006/picture">
+                <pic:pic xmlns:pic="http://schemas.openxmlformats.org/drawingml/2006/picture">
+                  <pic:nvPicPr>
+                    <pic:cNvPr id="1" name=""/>
+                    <pic:cNvPicPr/>
+                  </pic:nvPicPr>
+                  <pic:blipFill>
+                    <a:blip r:embed="rId43"/>
+                    <a:stretch>
+                      <a:fillRect/>
+                    </a:stretch>
+                  </pic:blipFill>
+                  <pic:spPr>
+                    <a:xfrm>
+                      <a:off x="0" y="0"/>
+                      <a:ext cx="4256790" cy="1231428"/>
+                    </a:xfrm>
+                    <a:prstGeom prst="rect">
+                      <a:avLst/>
+                    </a:prstGeom>
+                  </pic:spPr>
+                </pic:pic>
+              </a:graphicData>
+            </a:graphic>
+          </wp:inline>
+        </w:drawing>
+      </w:r>
+    </w:p>
+    <w:p>
+      <w:pPr>
+        <w:pStyle w:val="ListParagraph"/>
+        <w:ind w:left="1080"/>
+        <w:rPr>
+          <w:sz w:val="28"/>
+          <w:lang w:val="en-US"/>
+        </w:rPr>
+      </w:pPr>
+      <w:r>
+        <w:rPr>
+          <w:sz w:val="28"/>
+          <w:lang w:val="en-US"/>
+        </w:rPr>
+        <w:drawing>
+          <wp:inline distT="0" distB="0" distL="0" distR="0" wp14:anchorId="21166FBE" wp14:editId="74C99201">
+            <wp:extent cx="1362265" cy="447737"/>
+            <wp:effectExtent l="0" t="0" r="9525" b="9525"/>
+            <wp:docPr id="38" name="Picture 38"/>
+            <wp:cNvGraphicFramePr>
+              <a:graphicFrameLocks xmlns:a="http://schemas.openxmlformats.org/drawingml/2006/main" noChangeAspect="1"/>
+            </wp:cNvGraphicFramePr>
+            <a:graphic xmlns:a="http://schemas.openxmlformats.org/drawingml/2006/main">
+              <a:graphicData uri="http://schemas.openxmlformats.org/drawingml/2006/picture">
+                <pic:pic xmlns:pic="http://schemas.openxmlformats.org/drawingml/2006/picture">
+                  <pic:nvPicPr>
+                    <pic:cNvPr id="1" name=""/>
+                    <pic:cNvPicPr/>
+                  </pic:nvPicPr>
+                  <pic:blipFill>
+                    <a:blip r:embed="rId44"/>
+                    <a:stretch>
+                      <a:fillRect/>
+                    </a:stretch>
+                  </pic:blipFill>
+                  <pic:spPr>
+                    <a:xfrm>
+                      <a:off x="0" y="0"/>
+                      <a:ext cx="1362265" cy="447737"/>
+                    </a:xfrm>
+                    <a:prstGeom prst="rect">
+                      <a:avLst/>
+                    </a:prstGeom>
+                  </pic:spPr>
+                </pic:pic>
+              </a:graphicData>
+            </a:graphic>
+          </wp:inline>
+        </w:drawing>
+      </w:r>
+    </w:p>
+    <w:p>
+      <w:pPr>
+        <w:pStyle w:val="ListParagraph"/>
+        <w:ind w:left="1080"/>
+        <w:rPr>
+          <w:sz w:val="28"/>
+          <w:lang w:val="en-US"/>
+        </w:rPr>
+      </w:pPr>
+    </w:p>
+    <w:p>
+      <w:pPr>
+        <w:pStyle w:val="ListParagraph"/>
+        <w:ind w:left="1080"/>
+        <w:rPr>
+          <w:sz w:val="28"/>
+          <w:lang w:val="en-US"/>
+        </w:rPr>
+      </w:pPr>
+    </w:p>
+    <w:p>
+      <w:pPr>
+        <w:pStyle w:val="ListParagraph"/>
+        <w:ind w:left="1080"/>
+        <w:rPr>
+          <w:sz w:val="28"/>
+          <w:lang w:val="en-US"/>
+        </w:rPr>
+      </w:pPr>
+    </w:p>
+    <w:p>
+      <w:pPr>
+        <w:pStyle w:val="ListParagraph"/>
+        <w:ind w:left="1080"/>
+        <w:rPr>
+          <w:sz w:val="28"/>
+          <w:lang w:val="en-US"/>
+        </w:rPr>
+      </w:pPr>
+    </w:p>
+    <w:p>
+      <w:pPr>
+        <w:pStyle w:val="ListParagraph"/>
+        <w:ind w:left="1080"/>
+        <w:rPr>
+          <w:sz w:val="28"/>
+          <w:lang w:val="en-US"/>
+        </w:rPr>
+      </w:pPr>
+    </w:p>
+    <w:p>
+      <w:pPr>
+        <w:pStyle w:val="ListParagraph"/>
+        <w:ind w:left="1080"/>
+        <w:rPr>
+          <w:sz w:val="28"/>
+          <w:lang w:val="en-US"/>
+        </w:rPr>
+      </w:pPr>
+    </w:p>
+    <w:p>
+      <w:pPr>
+        <w:pStyle w:val="ListParagraph"/>
+        <w:ind w:left="1080"/>
+        <w:rPr>
+          <w:sz w:val="28"/>
+          <w:lang w:val="en-US"/>
+        </w:rPr>
+      </w:pPr>
+    </w:p>
+    <w:p>
+      <w:pPr>
+        <w:pStyle w:val="ListParagraph"/>
+        <w:numPr>
+          <w:ilvl w:val="0"/>
+          <w:numId w:val="2"/>
+        </w:numPr>
+        <w:rPr>
+          <w:sz w:val="28"/>
+          <w:lang w:val="en-US"/>
+        </w:rPr>
+      </w:pPr>
+      <w:r>
+        <w:rPr>
+          <w:b/>
+          <w:sz w:val="28"/>
+          <w:lang w:val="en-US"/>
+        </w:rPr>
+        <w:lastRenderedPageBreak/>
+        <w:t>Aim</w:t>
+      </w:r>
+      <w:r>
+        <w:rPr>
+          <w:sz w:val="28"/>
+          <w:lang w:val="en-US"/>
+        </w:rPr>
+        <w:t>: Write a program to demonstrate the use of access specifiers (Public, Private, Protected).</w:t>
+      </w:r>
+    </w:p>
+    <w:p>
+      <w:pPr>
+        <w:pStyle w:val="ListParagraph"/>
+        <w:numPr>
+          <w:ilvl w:val="0"/>
+          <w:numId w:val="7"/>
+        </w:numPr>
+        <w:rPr>
+          <w:sz w:val="28"/>
+          <w:lang w:val="en-US"/>
+        </w:rPr>
+      </w:pPr>
+      <w:r>
+        <w:rPr>
+          <w:sz w:val="28"/>
+          <w:lang w:val="en-US"/>
+        </w:rPr>
+        <w:t>Public Specifier: -</w:t>
+      </w:r>
+    </w:p>
+    <w:p>
+      <w:pPr>
+        <w:pStyle w:val="ListParagraph"/>
+        <w:ind w:left="1080"/>
+        <w:rPr>
+          <w:sz w:val="28"/>
+          <w:lang w:val="en-US"/>
+        </w:rPr>
+      </w:pPr>
+      <w:r>
+        <w:rPr>
+          <w:sz w:val="28"/>
+          <w:lang w:val="en-US"/>
+        </w:rPr>
+        <w:t xml:space="preserve"> </w:t>
+      </w:r>
+      <w:r>
+        <w:rPr>
+          <w:sz w:val="28"/>
+          <w:lang w:val="en-US"/>
+        </w:rPr>
+        <w:drawing>
+          <wp:inline distT="0" distB="0" distL="0" distR="0" wp14:anchorId="6E906816" wp14:editId="0079EFC8">
+            <wp:extent cx="3327400" cy="1971485"/>
+            <wp:effectExtent l="0" t="0" r="6350" b="0"/>
+            <wp:docPr id="39" name="Picture 39"/>
+            <wp:cNvGraphicFramePr>
+              <a:graphicFrameLocks xmlns:a="http://schemas.openxmlformats.org/drawingml/2006/main" noChangeAspect="1"/>
+            </wp:cNvGraphicFramePr>
+            <a:graphic xmlns:a="http://schemas.openxmlformats.org/drawingml/2006/main">
+              <a:graphicData uri="http://schemas.openxmlformats.org/drawingml/2006/picture">
+                <pic:pic xmlns:pic="http://schemas.openxmlformats.org/drawingml/2006/picture">
+                  <pic:nvPicPr>
+                    <pic:cNvPr id="1" name=""/>
+                    <pic:cNvPicPr/>
+                  </pic:nvPicPr>
+                  <pic:blipFill>
+                    <a:blip r:embed="rId45"/>
+                    <a:stretch>
+                      <a:fillRect/>
+                    </a:stretch>
+                  </pic:blipFill>
+                  <pic:spPr>
+                    <a:xfrm>
+                      <a:off x="0" y="0"/>
+                      <a:ext cx="3334254" cy="1975546"/>
+                    </a:xfrm>
+                    <a:prstGeom prst="rect">
+                      <a:avLst/>
+                    </a:prstGeom>
+                  </pic:spPr>
+                </pic:pic>
+              </a:graphicData>
+            </a:graphic>
+          </wp:inline>
+        </w:drawing>
+      </w:r>
+    </w:p>
+    <w:p>
+      <w:pPr>
+        <w:pStyle w:val="ListParagraph"/>
+        <w:ind w:left="1080"/>
+        <w:rPr>
+          <w:sz w:val="28"/>
+          <w:lang w:val="en-US"/>
+        </w:rPr>
+      </w:pPr>
+      <w:r>
+        <w:rPr>
+          <w:sz w:val="28"/>
+          <w:lang w:val="en-US"/>
+        </w:rPr>
+        <w:drawing>
+          <wp:inline distT="0" distB="0" distL="0" distR="0" wp14:anchorId="79FA0596" wp14:editId="7440AF60">
+            <wp:extent cx="990600" cy="404495"/>
+            <wp:effectExtent l="0" t="0" r="0" b="0"/>
+            <wp:docPr id="40" name="Picture 40"/>
+            <wp:cNvGraphicFramePr>
+              <a:graphicFrameLocks xmlns:a="http://schemas.openxmlformats.org/drawingml/2006/main" noChangeAspect="1"/>
+            </wp:cNvGraphicFramePr>
+            <a:graphic xmlns:a="http://schemas.openxmlformats.org/drawingml/2006/main">
+              <a:graphicData uri="http://schemas.openxmlformats.org/drawingml/2006/picture">
+                <pic:pic xmlns:pic="http://schemas.openxmlformats.org/drawingml/2006/picture">
+                  <pic:nvPicPr>
+                    <pic:cNvPr id="1" name=""/>
+                    <pic:cNvPicPr/>
+                  </pic:nvPicPr>
+                  <pic:blipFill>
+                    <a:blip r:embed="rId46"/>
+                    <a:stretch>
+                      <a:fillRect/>
+                    </a:stretch>
+                  </pic:blipFill>
+                  <pic:spPr>
+                    <a:xfrm>
+                      <a:off x="0" y="0"/>
+                      <a:ext cx="992677" cy="405343"/>
+                    </a:xfrm>
+                    <a:prstGeom prst="rect">
+                      <a:avLst/>
+                    </a:prstGeom>
+                  </pic:spPr>
+                </pic:pic>
+              </a:graphicData>
+            </a:graphic>
+          </wp:inline>
+        </w:drawing>
+      </w:r>
+    </w:p>
+    <w:p>
+      <w:pPr>
+        <w:pStyle w:val="ListParagraph"/>
+        <w:numPr>
+          <w:ilvl w:val="0"/>
+          <w:numId w:val="7"/>
+        </w:numPr>
+        <w:rPr>
+          <w:sz w:val="28"/>
+          <w:lang w:val="en-US"/>
+        </w:rPr>
+      </w:pPr>
+      <w:r>
+        <w:rPr>
+          <w:sz w:val="28"/>
+          <w:lang w:val="en-US"/>
+        </w:rPr>
+        <w:t>Private Specifier: -</w:t>
+      </w:r>
+    </w:p>
+    <w:p>
+      <w:pPr>
+        <w:pStyle w:val="ListParagraph"/>
+        <w:ind w:left="1080"/>
+        <w:rPr>
+          <w:sz w:val="28"/>
+          <w:lang w:val="en-US"/>
+        </w:rPr>
+      </w:pPr>
+      <w:r>
+        <w:rPr>
+          <w:sz w:val="28"/>
+          <w:lang w:val="en-US"/>
+        </w:rPr>
+        <w:drawing>
+          <wp:inline distT="0" distB="0" distL="0" distR="0" wp14:anchorId="2E1EBB9A" wp14:editId="7DD8A683">
+            <wp:extent cx="3130550" cy="1950447"/>
+            <wp:effectExtent l="0" t="0" r="0" b="0"/>
+            <wp:docPr id="41" name="Picture 41"/>
+            <wp:cNvGraphicFramePr>
+              <a:graphicFrameLocks xmlns:a="http://schemas.openxmlformats.org/drawingml/2006/main" noChangeAspect="1"/>
+            </wp:cNvGraphicFramePr>
+            <a:graphic xmlns:a="http://schemas.openxmlformats.org/drawingml/2006/main">
+              <a:graphicData uri="http://schemas.openxmlformats.org/drawingml/2006/picture">
+                <pic:pic xmlns:pic="http://schemas.openxmlformats.org/drawingml/2006/picture">
+                  <pic:nvPicPr>
+                    <pic:cNvPr id="1" name=""/>
+                    <pic:cNvPicPr/>
+                  </pic:nvPicPr>
+                  <pic:blipFill>
+                    <a:blip r:embed="rId47"/>
+                    <a:stretch>
+                      <a:fillRect/>
+                    </a:stretch>
+                  </pic:blipFill>
+                  <pic:spPr>
+                    <a:xfrm>
+                      <a:off x="0" y="0"/>
+                      <a:ext cx="3146987" cy="1960688"/>
+                    </a:xfrm>
+                    <a:prstGeom prst="rect">
+                      <a:avLst/>
+                    </a:prstGeom>
+                  </pic:spPr>
+                </pic:pic>
+              </a:graphicData>
+            </a:graphic>
+          </wp:inline>
+        </w:drawing>
+      </w:r>
+    </w:p>
+    <w:p>
+      <w:pPr>
+        <w:pStyle w:val="ListParagraph"/>
+        <w:ind w:left="1080"/>
+        <w:rPr>
+          <w:sz w:val="28"/>
+          <w:lang w:val="en-US"/>
+        </w:rPr>
+      </w:pPr>
+      <w:r>
+        <w:rPr>
+          <w:sz w:val="28"/>
+          <w:lang w:val="en-US"/>
+        </w:rPr>
+        <w:drawing>
+          <wp:inline distT="0" distB="0" distL="0" distR="0" wp14:anchorId="20C632F5" wp14:editId="6E9D984C">
+            <wp:extent cx="1143160" cy="352474"/>
+            <wp:effectExtent l="0" t="0" r="0" b="9525"/>
+            <wp:docPr id="42" name="Picture 42"/>
+            <wp:cNvGraphicFramePr>
+              <a:graphicFrameLocks xmlns:a="http://schemas.openxmlformats.org/drawingml/2006/main" noChangeAspect="1"/>
+            </wp:cNvGraphicFramePr>
+            <a:graphic xmlns:a="http://schemas.openxmlformats.org/drawingml/2006/main">
+              <a:graphicData uri="http://schemas.openxmlformats.org/drawingml/2006/picture">
+                <pic:pic xmlns:pic="http://schemas.openxmlformats.org/drawingml/2006/picture">
+                  <pic:nvPicPr>
+                    <pic:cNvPr id="1" name=""/>
+                    <pic:cNvPicPr/>
+                  </pic:nvPicPr>
+                  <pic:blipFill>
+                    <a:blip r:embed="rId48"/>
+                    <a:stretch>
+                      <a:fillRect/>
+                    </a:stretch>
+                  </pic:blipFill>
+                  <pic:spPr>
+                    <a:xfrm>
+                      <a:off x="0" y="0"/>
+                      <a:ext cx="1143160" cy="352474"/>
+                    </a:xfrm>
+                    <a:prstGeom prst="rect">
+                      <a:avLst/>
+                    </a:prstGeom>
+                  </pic:spPr>
+                </pic:pic>
+              </a:graphicData>
+            </a:graphic>
+          </wp:inline>
+        </w:drawing>
+      </w:r>
+      <w:r>
+        <w:rPr>
+          <w:sz w:val="28"/>
+          <w:lang w:val="en-US"/>
+        </w:rPr>
+        <w:t>0</w:t>
+      </w:r>
+    </w:p>
+    <w:p>
+      <w:pPr>
+        <w:pStyle w:val="ListParagraph"/>
+        <w:numPr>
+          <w:ilvl w:val="0"/>
+          <w:numId w:val="7"/>
+        </w:numPr>
+        <w:rPr>
+          <w:sz w:val="28"/>
+          <w:lang w:val="en-US"/>
+        </w:rPr>
+      </w:pPr>
+      <w:r>
+        <w:rPr>
+          <w:sz w:val="28"/>
+          <w:lang w:val="en-US"/>
+        </w:rPr>
+        <w:t>Protected Specifier: -</w:t>
+      </w:r>
+    </w:p>
+    <w:p>
+      <w:pPr>
+        <w:pStyle w:val="ListParagraph"/>
+        <w:ind w:left="1080"/>
+        <w:rPr>
+          <w:sz w:val="28"/>
+          <w:lang w:val="en-US"/>
+        </w:rPr>
+      </w:pPr>
+      <w:r>
+        <w:rPr>
+          <w:sz w:val="28"/>
+          <w:lang w:val="en-US"/>
+        </w:rPr>
+        <w:drawing>
+          <wp:inline distT="0" distB="0" distL="0" distR="0" wp14:anchorId="6897FC04" wp14:editId="01066665">
+            <wp:extent cx="3117850" cy="1566961"/>
+            <wp:effectExtent l="0" t="0" r="6350" b="0"/>
+            <wp:docPr id="43" name="Picture 43"/>
+            <wp:cNvGraphicFramePr>
+              <a:graphicFrameLocks xmlns:a="http://schemas.openxmlformats.org/drawingml/2006/main" noChangeAspect="1"/>
+            </wp:cNvGraphicFramePr>
+            <a:graphic xmlns:a="http://schemas.openxmlformats.org/drawingml/2006/main">
+              <a:graphicData uri="http://schemas.openxmlformats.org/drawingml/2006/picture">
+                <pic:pic xmlns:pic="http://schemas.openxmlformats.org/drawingml/2006/picture">
+                  <pic:nvPicPr>
+                    <pic:cNvPr id="1" name=""/>
+                    <pic:cNvPicPr/>
+                  </pic:nvPicPr>
+                  <pic:blipFill>
+                    <a:blip r:embed="rId49"/>
+                    <a:stretch>
+                      <a:fillRect/>
+                    </a:stretch>
+                  </pic:blipFill>
+                  <pic:spPr>
+                    <a:xfrm>
+                      <a:off x="0" y="0"/>
+                      <a:ext cx="3128233" cy="1572179"/>
+                    </a:xfrm>
+                    <a:prstGeom prst="rect">
+                      <a:avLst/>
+                    </a:prstGeom>
+                  </pic:spPr>
+                </pic:pic>
+              </a:graphicData>
+            </a:graphic>
+          </wp:inline>
+        </w:drawing>
+      </w:r>
+    </w:p>
+    <w:p>
+      <w:pPr>
+        <w:pStyle w:val="ListParagraph"/>
+        <w:ind w:left="1080"/>
+        <w:rPr>
+          <w:sz w:val="28"/>
+          <w:lang w:val="en-US"/>
+        </w:rPr>
+      </w:pPr>
+      <w:r>
+        <w:rPr>
+          <w:sz w:val="28"/>
+          <w:lang w:val="en-US"/>
+        </w:rPr>
+        <w:drawing>
+          <wp:inline distT="0" distB="0" distL="0" distR="0" wp14:anchorId="31D42696" wp14:editId="32D90376">
+            <wp:extent cx="1209844" cy="400106"/>
+            <wp:effectExtent l="0" t="0" r="9525" b="0"/>
+            <wp:docPr id="44" name="Picture 44"/>
+            <wp:cNvGraphicFramePr>
+              <a:graphicFrameLocks xmlns:a="http://schemas.openxmlformats.org/drawingml/2006/main" noChangeAspect="1"/>
+            </wp:cNvGraphicFramePr>
+            <a:graphic xmlns:a="http://schemas.openxmlformats.org/drawingml/2006/main">
+              <a:graphicData uri="http://schemas.openxmlformats.org/drawingml/2006/picture">
+                <pic:pic xmlns:pic="http://schemas.openxmlformats.org/drawingml/2006/picture">
+                  <pic:nvPicPr>
+                    <pic:cNvPr id="1" name=""/>
+                    <pic:cNvPicPr/>
+                  </pic:nvPicPr>
+                  <pic:blipFill>
+                    <a:blip r:embed="rId50"/>
+                    <a:stretch>
+                      <a:fillRect/>
+                    </a:stretch>
+                  </pic:blipFill>
+                  <pic:spPr>
+                    <a:xfrm>
+                      <a:off x="0" y="0"/>
+                      <a:ext cx="1209844" cy="400106"/>
+                    </a:xfrm>
+                    <a:prstGeom prst="rect">
+                      <a:avLst/>
+                    </a:prstGeom>
+                  </pic:spPr>
+                </pic:pic>
+              </a:graphicData>
+            </a:graphic>
+          </wp:inline>
+        </w:drawing>
+      </w:r>
+      <w:bookmarkStart w:id="0" w:name="_GoBack"/>
+      <w:bookmarkEnd w:id="0"/>
+    </w:p>
     <w:sectPr>
-      <w:headerReference w:type="default" r:id="rId29"/>
-      <w:footerReference w:type="default" r:id="rId30"/>
+      <w:headerReference w:type="default" r:id="rId51"/>
+      <w:footerReference w:type="default" r:id="rId52"/>
       <w:pgSz w:w="11906" w:h="16838"/>
-      <w:pgMar w:top="1440" w:right="1440" w:bottom="1440" w:left="1440" w:header="708" w:footer="708" w:gutter="0"/>
+      <w:pgMar w:top="720" w:right="720" w:bottom="720" w:left="720" w:header="708" w:footer="708" w:gutter="0"/>
       <w:cols w:space="708"/>
       <w:docGrid w:linePitch="360"/>
     </w:sectPr>
@@ -1834,7 +3551,31 @@
         <w:lang w:val="en-US"/>
       </w:rPr>
       <w:tab/>
-      <w:t xml:space="preserve">                                                                                                                                             Practical’s</w:t>
+      <w:t xml:space="preserve">                                                                                                                                           </w:t>
+    </w:r>
+    <w:r>
+      <w:rPr>
+        <w:lang w:val="en-US"/>
+      </w:rPr>
+      <w:t xml:space="preserve">                                       </w:t>
+    </w:r>
+    <w:r>
+      <w:rPr>
+        <w:lang w:val="en-US"/>
+      </w:rPr>
+      <w:t xml:space="preserve"> </w:t>
+    </w:r>
+    <w:r>
+      <w:rPr>
+        <w:lang w:val="en-US"/>
+      </w:rPr>
+      <w:t xml:space="preserve">   </w:t>
+    </w:r>
+    <w:r>
+      <w:rPr>
+        <w:lang w:val="en-US"/>
+      </w:rPr>
+      <w:t xml:space="preserve"> Practical’s</w:t>
     </w:r>
   </w:p>
 </w:hdr>
@@ -1843,6 +3584,453 @@
 <file path=word/numbering.xml><?xml version="1.0" encoding="utf-8"?>
 <w:numbering xmlns:wpc="http://schemas.microsoft.com/office/word/2010/wordprocessingCanvas" xmlns:cx="http://schemas.microsoft.com/office/drawing/2014/chartex" xmlns:cx1="http://schemas.microsoft.com/office/drawing/2015/9/8/chartex" xmlns:cx2="http://schemas.microsoft.com/office/drawing/2015/10/21/chartex" xmlns:cx3="http://schemas.microsoft.com/office/drawing/2016/5/9/chartex" xmlns:cx4="http://schemas.microsoft.com/office/drawing/2016/5/10/chartex" xmlns:cx5="http://schemas.microsoft.com/office/drawing/2016/5/11/chartex" xmlns:cx6="http://schemas.microsoft.com/office/drawing/2016/5/12/chartex" xmlns:cx7="http://schemas.microsoft.com/office/drawing/2016/5/13/chartex" xmlns:cx8="http://schemas.microsoft.com/office/drawing/2016/5/14/chartex" xmlns:mc="http://schemas.openxmlformats.org/markup-compatibility/2006" xmlns:aink="http://schemas.microsoft.com/office/drawing/2016/ink" xmlns:am3d="http://schemas.microsoft.com/office/drawing/2017/model3d" xmlns:o="urn:schemas-microsoft-com:office:office" xmlns:r="http://schemas.openxmlformats.org/officeDocument/2006/relationships" xmlns:m="http://schemas.openxmlformats.org/officeDocument/2006/math" xmlns:v="urn:schemas-microsoft-com:vml" xmlns:wp14="http://schemas.microsoft.com/office/word/2010/wordprocessingDrawing" xmlns:wp="http://schemas.openxmlformats.org/drawingml/2006/wordprocessingDrawing" xmlns:w10="urn:schemas-microsoft-com:office:word" xmlns:w="http://schemas.openxmlformats.org/wordprocessingml/2006/main" xmlns:w14="http://schemas.microsoft.com/office/word/2010/wordml" xmlns:w15="http://schemas.microsoft.com/office/word/2012/wordml" xmlns:w16cid="http://schemas.microsoft.com/office/word/2016/wordml/cid" xmlns:w16se="http://schemas.microsoft.com/office/word/2015/wordml/symex" xmlns:wpg="http://schemas.microsoft.com/office/word/2010/wordprocessingGroup" xmlns:wpi="http://schemas.microsoft.com/office/word/2010/wordprocessingInk" xmlns:wne="http://schemas.microsoft.com/office/word/2006/wordml" xmlns:wps="http://schemas.microsoft.com/office/word/2010/wordprocessingShape" mc:Ignorable="w14 w15 w16se w16cid wp14">
   <w:abstractNum w:abstractNumId="0" w15:restartNumberingAfterBreak="0">
+    <w:nsid w:val="0D1052E2"/>
+    <w:multiLevelType w:val="hybridMultilevel"/>
+    <w:tmpl w:val="780CF4EE"/>
+    <w:lvl w:ilvl="0" w:tplc="F52E9E04">
+      <w:start w:val="1"/>
+      <w:numFmt w:val="decimal"/>
+      <w:lvlText w:val="%1."/>
+      <w:lvlJc w:val="left"/>
+      <w:pPr>
+        <w:ind w:left="1080" w:hanging="360"/>
+      </w:pPr>
+      <w:rPr>
+        <w:rFonts w:hint="default"/>
+        <w:b/>
+      </w:rPr>
+    </w:lvl>
+    <w:lvl w:ilvl="1" w:tplc="40090019" w:tentative="1">
+      <w:start w:val="1"/>
+      <w:numFmt w:val="lowerLetter"/>
+      <w:lvlText w:val="%2."/>
+      <w:lvlJc w:val="left"/>
+      <w:pPr>
+        <w:ind w:left="1800" w:hanging="360"/>
+      </w:pPr>
+    </w:lvl>
+    <w:lvl w:ilvl="2" w:tplc="4009001B" w:tentative="1">
+      <w:start w:val="1"/>
+      <w:numFmt w:val="lowerRoman"/>
+      <w:lvlText w:val="%3."/>
+      <w:lvlJc w:val="right"/>
+      <w:pPr>
+        <w:ind w:left="2520" w:hanging="180"/>
+      </w:pPr>
+    </w:lvl>
+    <w:lvl w:ilvl="3" w:tplc="4009000F" w:tentative="1">
+      <w:start w:val="1"/>
+      <w:numFmt w:val="decimal"/>
+      <w:lvlText w:val="%4."/>
+      <w:lvlJc w:val="left"/>
+      <w:pPr>
+        <w:ind w:left="3240" w:hanging="360"/>
+      </w:pPr>
+    </w:lvl>
+    <w:lvl w:ilvl="4" w:tplc="40090019" w:tentative="1">
+      <w:start w:val="1"/>
+      <w:numFmt w:val="lowerLetter"/>
+      <w:lvlText w:val="%5."/>
+      <w:lvlJc w:val="left"/>
+      <w:pPr>
+        <w:ind w:left="3960" w:hanging="360"/>
+      </w:pPr>
+    </w:lvl>
+    <w:lvl w:ilvl="5" w:tplc="4009001B" w:tentative="1">
+      <w:start w:val="1"/>
+      <w:numFmt w:val="lowerRoman"/>
+      <w:lvlText w:val="%6."/>
+      <w:lvlJc w:val="right"/>
+      <w:pPr>
+        <w:ind w:left="4680" w:hanging="180"/>
+      </w:pPr>
+    </w:lvl>
+    <w:lvl w:ilvl="6" w:tplc="4009000F" w:tentative="1">
+      <w:start w:val="1"/>
+      <w:numFmt w:val="decimal"/>
+      <w:lvlText w:val="%7."/>
+      <w:lvlJc w:val="left"/>
+      <w:pPr>
+        <w:ind w:left="5400" w:hanging="360"/>
+      </w:pPr>
+    </w:lvl>
+    <w:lvl w:ilvl="7" w:tplc="40090019" w:tentative="1">
+      <w:start w:val="1"/>
+      <w:numFmt w:val="lowerLetter"/>
+      <w:lvlText w:val="%8."/>
+      <w:lvlJc w:val="left"/>
+      <w:pPr>
+        <w:ind w:left="6120" w:hanging="360"/>
+      </w:pPr>
+    </w:lvl>
+    <w:lvl w:ilvl="8" w:tplc="4009001B" w:tentative="1">
+      <w:start w:val="1"/>
+      <w:numFmt w:val="lowerRoman"/>
+      <w:lvlText w:val="%9."/>
+      <w:lvlJc w:val="right"/>
+      <w:pPr>
+        <w:ind w:left="6840" w:hanging="180"/>
+      </w:pPr>
+    </w:lvl>
+  </w:abstractNum>
+  <w:abstractNum w:abstractNumId="1" w15:restartNumberingAfterBreak="0">
+    <w:nsid w:val="1B51172D"/>
+    <w:multiLevelType w:val="hybridMultilevel"/>
+    <w:tmpl w:val="B3E86354"/>
+    <w:lvl w:ilvl="0" w:tplc="4BE86388">
+      <w:start w:val="1"/>
+      <w:numFmt w:val="decimal"/>
+      <w:lvlText w:val="%1."/>
+      <w:lvlJc w:val="left"/>
+      <w:pPr>
+        <w:ind w:left="1080" w:hanging="360"/>
+      </w:pPr>
+      <w:rPr>
+        <w:rFonts w:hint="default"/>
+      </w:rPr>
+    </w:lvl>
+    <w:lvl w:ilvl="1" w:tplc="40090019" w:tentative="1">
+      <w:start w:val="1"/>
+      <w:numFmt w:val="lowerLetter"/>
+      <w:lvlText w:val="%2."/>
+      <w:lvlJc w:val="left"/>
+      <w:pPr>
+        <w:ind w:left="1800" w:hanging="360"/>
+      </w:pPr>
+    </w:lvl>
+    <w:lvl w:ilvl="2" w:tplc="4009001B" w:tentative="1">
+      <w:start w:val="1"/>
+      <w:numFmt w:val="lowerRoman"/>
+      <w:lvlText w:val="%3."/>
+      <w:lvlJc w:val="right"/>
+      <w:pPr>
+        <w:ind w:left="2520" w:hanging="180"/>
+      </w:pPr>
+    </w:lvl>
+    <w:lvl w:ilvl="3" w:tplc="4009000F" w:tentative="1">
+      <w:start w:val="1"/>
+      <w:numFmt w:val="decimal"/>
+      <w:lvlText w:val="%4."/>
+      <w:lvlJc w:val="left"/>
+      <w:pPr>
+        <w:ind w:left="3240" w:hanging="360"/>
+      </w:pPr>
+    </w:lvl>
+    <w:lvl w:ilvl="4" w:tplc="40090019" w:tentative="1">
+      <w:start w:val="1"/>
+      <w:numFmt w:val="lowerLetter"/>
+      <w:lvlText w:val="%5."/>
+      <w:lvlJc w:val="left"/>
+      <w:pPr>
+        <w:ind w:left="3960" w:hanging="360"/>
+      </w:pPr>
+    </w:lvl>
+    <w:lvl w:ilvl="5" w:tplc="4009001B" w:tentative="1">
+      <w:start w:val="1"/>
+      <w:numFmt w:val="lowerRoman"/>
+      <w:lvlText w:val="%6."/>
+      <w:lvlJc w:val="right"/>
+      <w:pPr>
+        <w:ind w:left="4680" w:hanging="180"/>
+      </w:pPr>
+    </w:lvl>
+    <w:lvl w:ilvl="6" w:tplc="4009000F" w:tentative="1">
+      <w:start w:val="1"/>
+      <w:numFmt w:val="decimal"/>
+      <w:lvlText w:val="%7."/>
+      <w:lvlJc w:val="left"/>
+      <w:pPr>
+        <w:ind w:left="5400" w:hanging="360"/>
+      </w:pPr>
+    </w:lvl>
+    <w:lvl w:ilvl="7" w:tplc="40090019" w:tentative="1">
+      <w:start w:val="1"/>
+      <w:numFmt w:val="lowerLetter"/>
+      <w:lvlText w:val="%8."/>
+      <w:lvlJc w:val="left"/>
+      <w:pPr>
+        <w:ind w:left="6120" w:hanging="360"/>
+      </w:pPr>
+    </w:lvl>
+    <w:lvl w:ilvl="8" w:tplc="4009001B" w:tentative="1">
+      <w:start w:val="1"/>
+      <w:numFmt w:val="lowerRoman"/>
+      <w:lvlText w:val="%9."/>
+      <w:lvlJc w:val="right"/>
+      <w:pPr>
+        <w:ind w:left="6840" w:hanging="180"/>
+      </w:pPr>
+    </w:lvl>
+  </w:abstractNum>
+  <w:abstractNum w:abstractNumId="2" w15:restartNumberingAfterBreak="0">
+    <w:nsid w:val="20620D70"/>
+    <w:multiLevelType w:val="hybridMultilevel"/>
+    <w:tmpl w:val="E1C0072A"/>
+    <w:lvl w:ilvl="0" w:tplc="4009000F">
+      <w:start w:val="1"/>
+      <w:numFmt w:val="decimal"/>
+      <w:lvlText w:val="%1."/>
+      <w:lvlJc w:val="left"/>
+      <w:pPr>
+        <w:ind w:left="1080" w:hanging="360"/>
+      </w:pPr>
+      <w:rPr>
+        <w:rFonts w:hint="default"/>
+      </w:rPr>
+    </w:lvl>
+    <w:lvl w:ilvl="1" w:tplc="40090019" w:tentative="1">
+      <w:start w:val="1"/>
+      <w:numFmt w:val="lowerLetter"/>
+      <w:lvlText w:val="%2."/>
+      <w:lvlJc w:val="left"/>
+      <w:pPr>
+        <w:ind w:left="1800" w:hanging="360"/>
+      </w:pPr>
+    </w:lvl>
+    <w:lvl w:ilvl="2" w:tplc="4009001B" w:tentative="1">
+      <w:start w:val="1"/>
+      <w:numFmt w:val="lowerRoman"/>
+      <w:lvlText w:val="%3."/>
+      <w:lvlJc w:val="right"/>
+      <w:pPr>
+        <w:ind w:left="2520" w:hanging="180"/>
+      </w:pPr>
+    </w:lvl>
+    <w:lvl w:ilvl="3" w:tplc="4009000F" w:tentative="1">
+      <w:start w:val="1"/>
+      <w:numFmt w:val="decimal"/>
+      <w:lvlText w:val="%4."/>
+      <w:lvlJc w:val="left"/>
+      <w:pPr>
+        <w:ind w:left="3240" w:hanging="360"/>
+      </w:pPr>
+    </w:lvl>
+    <w:lvl w:ilvl="4" w:tplc="40090019" w:tentative="1">
+      <w:start w:val="1"/>
+      <w:numFmt w:val="lowerLetter"/>
+      <w:lvlText w:val="%5."/>
+      <w:lvlJc w:val="left"/>
+      <w:pPr>
+        <w:ind w:left="3960" w:hanging="360"/>
+      </w:pPr>
+    </w:lvl>
+    <w:lvl w:ilvl="5" w:tplc="4009001B" w:tentative="1">
+      <w:start w:val="1"/>
+      <w:numFmt w:val="lowerRoman"/>
+      <w:lvlText w:val="%6."/>
+      <w:lvlJc w:val="right"/>
+      <w:pPr>
+        <w:ind w:left="4680" w:hanging="180"/>
+      </w:pPr>
+    </w:lvl>
+    <w:lvl w:ilvl="6" w:tplc="4009000F" w:tentative="1">
+      <w:start w:val="1"/>
+      <w:numFmt w:val="decimal"/>
+      <w:lvlText w:val="%7."/>
+      <w:lvlJc w:val="left"/>
+      <w:pPr>
+        <w:ind w:left="5400" w:hanging="360"/>
+      </w:pPr>
+    </w:lvl>
+    <w:lvl w:ilvl="7" w:tplc="40090019" w:tentative="1">
+      <w:start w:val="1"/>
+      <w:numFmt w:val="lowerLetter"/>
+      <w:lvlText w:val="%8."/>
+      <w:lvlJc w:val="left"/>
+      <w:pPr>
+        <w:ind w:left="6120" w:hanging="360"/>
+      </w:pPr>
+    </w:lvl>
+    <w:lvl w:ilvl="8" w:tplc="4009001B" w:tentative="1">
+      <w:start w:val="1"/>
+      <w:numFmt w:val="lowerRoman"/>
+      <w:lvlText w:val="%9."/>
+      <w:lvlJc w:val="right"/>
+      <w:pPr>
+        <w:ind w:left="6840" w:hanging="180"/>
+      </w:pPr>
+    </w:lvl>
+  </w:abstractNum>
+  <w:abstractNum w:abstractNumId="3" w15:restartNumberingAfterBreak="0">
+    <w:nsid w:val="27615FB4"/>
+    <w:multiLevelType w:val="hybridMultilevel"/>
+    <w:tmpl w:val="AAFAEDC6"/>
+    <w:lvl w:ilvl="0" w:tplc="4009000F">
+      <w:start w:val="1"/>
+      <w:numFmt w:val="decimal"/>
+      <w:lvlText w:val="%1."/>
+      <w:lvlJc w:val="left"/>
+      <w:pPr>
+        <w:ind w:left="1080" w:hanging="360"/>
+      </w:pPr>
+      <w:rPr>
+        <w:rFonts w:hint="default"/>
+      </w:rPr>
+    </w:lvl>
+    <w:lvl w:ilvl="1" w:tplc="40090019" w:tentative="1">
+      <w:start w:val="1"/>
+      <w:numFmt w:val="lowerLetter"/>
+      <w:lvlText w:val="%2."/>
+      <w:lvlJc w:val="left"/>
+      <w:pPr>
+        <w:ind w:left="1800" w:hanging="360"/>
+      </w:pPr>
+    </w:lvl>
+    <w:lvl w:ilvl="2" w:tplc="4009001B" w:tentative="1">
+      <w:start w:val="1"/>
+      <w:numFmt w:val="lowerRoman"/>
+      <w:lvlText w:val="%3."/>
+      <w:lvlJc w:val="right"/>
+      <w:pPr>
+        <w:ind w:left="2520" w:hanging="180"/>
+      </w:pPr>
+    </w:lvl>
+    <w:lvl w:ilvl="3" w:tplc="4009000F" w:tentative="1">
+      <w:start w:val="1"/>
+      <w:numFmt w:val="decimal"/>
+      <w:lvlText w:val="%4."/>
+      <w:lvlJc w:val="left"/>
+      <w:pPr>
+        <w:ind w:left="3240" w:hanging="360"/>
+      </w:pPr>
+    </w:lvl>
+    <w:lvl w:ilvl="4" w:tplc="40090019" w:tentative="1">
+      <w:start w:val="1"/>
+      <w:numFmt w:val="lowerLetter"/>
+      <w:lvlText w:val="%5."/>
+      <w:lvlJc w:val="left"/>
+      <w:pPr>
+        <w:ind w:left="3960" w:hanging="360"/>
+      </w:pPr>
+    </w:lvl>
+    <w:lvl w:ilvl="5" w:tplc="4009001B" w:tentative="1">
+      <w:start w:val="1"/>
+      <w:numFmt w:val="lowerRoman"/>
+      <w:lvlText w:val="%6."/>
+      <w:lvlJc w:val="right"/>
+      <w:pPr>
+        <w:ind w:left="4680" w:hanging="180"/>
+      </w:pPr>
+    </w:lvl>
+    <w:lvl w:ilvl="6" w:tplc="4009000F" w:tentative="1">
+      <w:start w:val="1"/>
+      <w:numFmt w:val="decimal"/>
+      <w:lvlText w:val="%7."/>
+      <w:lvlJc w:val="left"/>
+      <w:pPr>
+        <w:ind w:left="5400" w:hanging="360"/>
+      </w:pPr>
+    </w:lvl>
+    <w:lvl w:ilvl="7" w:tplc="40090019" w:tentative="1">
+      <w:start w:val="1"/>
+      <w:numFmt w:val="lowerLetter"/>
+      <w:lvlText w:val="%8."/>
+      <w:lvlJc w:val="left"/>
+      <w:pPr>
+        <w:ind w:left="6120" w:hanging="360"/>
+      </w:pPr>
+    </w:lvl>
+    <w:lvl w:ilvl="8" w:tplc="4009001B" w:tentative="1">
+      <w:start w:val="1"/>
+      <w:numFmt w:val="lowerRoman"/>
+      <w:lvlText w:val="%9."/>
+      <w:lvlJc w:val="right"/>
+      <w:pPr>
+        <w:ind w:left="6840" w:hanging="180"/>
+      </w:pPr>
+    </w:lvl>
+  </w:abstractNum>
+  <w:abstractNum w:abstractNumId="4" w15:restartNumberingAfterBreak="0">
+    <w:nsid w:val="3B9917D8"/>
+    <w:multiLevelType w:val="hybridMultilevel"/>
+    <w:tmpl w:val="5D8884B2"/>
+    <w:lvl w:ilvl="0" w:tplc="7C320C6E">
+      <w:start w:val="1"/>
+      <w:numFmt w:val="decimal"/>
+      <w:lvlText w:val="%1."/>
+      <w:lvlJc w:val="left"/>
+      <w:pPr>
+        <w:ind w:left="1080" w:hanging="360"/>
+      </w:pPr>
+      <w:rPr>
+        <w:rFonts w:hint="default"/>
+        <w:b/>
+      </w:rPr>
+    </w:lvl>
+    <w:lvl w:ilvl="1" w:tplc="40090019" w:tentative="1">
+      <w:start w:val="1"/>
+      <w:numFmt w:val="lowerLetter"/>
+      <w:lvlText w:val="%2."/>
+      <w:lvlJc w:val="left"/>
+      <w:pPr>
+        <w:ind w:left="1800" w:hanging="360"/>
+      </w:pPr>
+    </w:lvl>
+    <w:lvl w:ilvl="2" w:tplc="4009001B" w:tentative="1">
+      <w:start w:val="1"/>
+      <w:numFmt w:val="lowerRoman"/>
+      <w:lvlText w:val="%3."/>
+      <w:lvlJc w:val="right"/>
+      <w:pPr>
+        <w:ind w:left="2520" w:hanging="180"/>
+      </w:pPr>
+    </w:lvl>
+    <w:lvl w:ilvl="3" w:tplc="4009000F" w:tentative="1">
+      <w:start w:val="1"/>
+      <w:numFmt w:val="decimal"/>
+      <w:lvlText w:val="%4."/>
+      <w:lvlJc w:val="left"/>
+      <w:pPr>
+        <w:ind w:left="3240" w:hanging="360"/>
+      </w:pPr>
+    </w:lvl>
+    <w:lvl w:ilvl="4" w:tplc="40090019" w:tentative="1">
+      <w:start w:val="1"/>
+      <w:numFmt w:val="lowerLetter"/>
+      <w:lvlText w:val="%5."/>
+      <w:lvlJc w:val="left"/>
+      <w:pPr>
+        <w:ind w:left="3960" w:hanging="360"/>
+      </w:pPr>
+    </w:lvl>
+    <w:lvl w:ilvl="5" w:tplc="4009001B" w:tentative="1">
+      <w:start w:val="1"/>
+      <w:numFmt w:val="lowerRoman"/>
+      <w:lvlText w:val="%6."/>
+      <w:lvlJc w:val="right"/>
+      <w:pPr>
+        <w:ind w:left="4680" w:hanging="180"/>
+      </w:pPr>
+    </w:lvl>
+    <w:lvl w:ilvl="6" w:tplc="4009000F" w:tentative="1">
+      <w:start w:val="1"/>
+      <w:numFmt w:val="decimal"/>
+      <w:lvlText w:val="%7."/>
+      <w:lvlJc w:val="left"/>
+      <w:pPr>
+        <w:ind w:left="5400" w:hanging="360"/>
+      </w:pPr>
+    </w:lvl>
+    <w:lvl w:ilvl="7" w:tplc="40090019" w:tentative="1">
+      <w:start w:val="1"/>
+      <w:numFmt w:val="lowerLetter"/>
+      <w:lvlText w:val="%8."/>
+      <w:lvlJc w:val="left"/>
+      <w:pPr>
+        <w:ind w:left="6120" w:hanging="360"/>
+      </w:pPr>
+    </w:lvl>
+    <w:lvl w:ilvl="8" w:tplc="4009001B" w:tentative="1">
+      <w:start w:val="1"/>
+      <w:numFmt w:val="lowerRoman"/>
+      <w:lvlText w:val="%9."/>
+      <w:lvlJc w:val="right"/>
+      <w:pPr>
+        <w:ind w:left="6840" w:hanging="180"/>
+      </w:pPr>
+    </w:lvl>
+  </w:abstractNum>
+  <w:abstractNum w:abstractNumId="5" w15:restartNumberingAfterBreak="0">
     <w:nsid w:val="4E060361"/>
     <w:multiLevelType w:val="hybridMultilevel"/>
     <w:tmpl w:val="C658D710"/>
@@ -1931,8 +4119,115 @@
       </w:pPr>
     </w:lvl>
   </w:abstractNum>
+  <w:abstractNum w:abstractNumId="6" w15:restartNumberingAfterBreak="0">
+    <w:nsid w:val="75DC4A5E"/>
+    <w:multiLevelType w:val="hybridMultilevel"/>
+    <w:tmpl w:val="C4323984"/>
+    <w:lvl w:ilvl="0" w:tplc="DE3A049A">
+      <w:start w:val="1"/>
+      <w:numFmt w:val="upperLetter"/>
+      <w:lvlText w:val="%1)"/>
+      <w:lvlJc w:val="left"/>
+      <w:pPr>
+        <w:ind w:left="720" w:hanging="360"/>
+      </w:pPr>
+      <w:rPr>
+        <w:rFonts w:hint="default"/>
+      </w:rPr>
+    </w:lvl>
+    <w:lvl w:ilvl="1" w:tplc="40090019" w:tentative="1">
+      <w:start w:val="1"/>
+      <w:numFmt w:val="lowerLetter"/>
+      <w:lvlText w:val="%2."/>
+      <w:lvlJc w:val="left"/>
+      <w:pPr>
+        <w:ind w:left="1440" w:hanging="360"/>
+      </w:pPr>
+    </w:lvl>
+    <w:lvl w:ilvl="2" w:tplc="4009001B" w:tentative="1">
+      <w:start w:val="1"/>
+      <w:numFmt w:val="lowerRoman"/>
+      <w:lvlText w:val="%3."/>
+      <w:lvlJc w:val="right"/>
+      <w:pPr>
+        <w:ind w:left="2160" w:hanging="180"/>
+      </w:pPr>
+    </w:lvl>
+    <w:lvl w:ilvl="3" w:tplc="4009000F" w:tentative="1">
+      <w:start w:val="1"/>
+      <w:numFmt w:val="decimal"/>
+      <w:lvlText w:val="%4."/>
+      <w:lvlJc w:val="left"/>
+      <w:pPr>
+        <w:ind w:left="2880" w:hanging="360"/>
+      </w:pPr>
+    </w:lvl>
+    <w:lvl w:ilvl="4" w:tplc="40090019" w:tentative="1">
+      <w:start w:val="1"/>
+      <w:numFmt w:val="lowerLetter"/>
+      <w:lvlText w:val="%5."/>
+      <w:lvlJc w:val="left"/>
+      <w:pPr>
+        <w:ind w:left="3600" w:hanging="360"/>
+      </w:pPr>
+    </w:lvl>
+    <w:lvl w:ilvl="5" w:tplc="4009001B" w:tentative="1">
+      <w:start w:val="1"/>
+      <w:numFmt w:val="lowerRoman"/>
+      <w:lvlText w:val="%6."/>
+      <w:lvlJc w:val="right"/>
+      <w:pPr>
+        <w:ind w:left="4320" w:hanging="180"/>
+      </w:pPr>
+    </w:lvl>
+    <w:lvl w:ilvl="6" w:tplc="4009000F" w:tentative="1">
+      <w:start w:val="1"/>
+      <w:numFmt w:val="decimal"/>
+      <w:lvlText w:val="%7."/>
+      <w:lvlJc w:val="left"/>
+      <w:pPr>
+        <w:ind w:left="5040" w:hanging="360"/>
+      </w:pPr>
+    </w:lvl>
+    <w:lvl w:ilvl="7" w:tplc="40090019" w:tentative="1">
+      <w:start w:val="1"/>
+      <w:numFmt w:val="lowerLetter"/>
+      <w:lvlText w:val="%8."/>
+      <w:lvlJc w:val="left"/>
+      <w:pPr>
+        <w:ind w:left="5760" w:hanging="360"/>
+      </w:pPr>
+    </w:lvl>
+    <w:lvl w:ilvl="8" w:tplc="4009001B" w:tentative="1">
+      <w:start w:val="1"/>
+      <w:numFmt w:val="lowerRoman"/>
+      <w:lvlText w:val="%9."/>
+      <w:lvlJc w:val="right"/>
+      <w:pPr>
+        <w:ind w:left="6480" w:hanging="180"/>
+      </w:pPr>
+    </w:lvl>
+  </w:abstractNum>
   <w:num w:numId="1">
+    <w:abstractNumId w:val="5"/>
+  </w:num>
+  <w:num w:numId="2">
+    <w:abstractNumId w:val="6"/>
+  </w:num>
+  <w:num w:numId="3">
     <w:abstractNumId w:val="0"/>
+  </w:num>
+  <w:num w:numId="4">
+    <w:abstractNumId w:val="2"/>
+  </w:num>
+  <w:num w:numId="5">
+    <w:abstractNumId w:val="1"/>
+  </w:num>
+  <w:num w:numId="6">
+    <w:abstractNumId w:val="4"/>
+  </w:num>
+  <w:num w:numId="7">
+    <w:abstractNumId w:val="3"/>
   </w:num>
 </w:numbering>
 </file>
@@ -2334,6 +4629,7 @@
   <w:style w:type="paragraph" w:default="1" w:styleId="Normal">
     <w:name w:val="Normal"/>
     <w:qFormat/>
+    <w:rsid w:val="00566BDC"/>
   </w:style>
   <w:style w:type="character" w:default="1" w:styleId="DefaultParagraphFont">
     <w:name w:val="Default Paragraph Font"/>
@@ -2416,6 +4712,29 @@
     <w:link w:val="Footer"/>
     <w:uiPriority w:val="99"/>
     <w:rsid w:val="00833A0C"/>
+  </w:style>
+  <w:style w:type="character" w:styleId="Hyperlink">
+    <w:name w:val="Hyperlink"/>
+    <w:basedOn w:val="DefaultParagraphFont"/>
+    <w:uiPriority w:val="99"/>
+    <w:unhideWhenUsed/>
+    <w:rsid w:val="00DC3908"/>
+    <w:rPr>
+      <w:color w:val="0563C1" w:themeColor="hyperlink"/>
+      <w:u w:val="single"/>
+    </w:rPr>
+  </w:style>
+  <w:style w:type="character" w:styleId="UnresolvedMention">
+    <w:name w:val="Unresolved Mention"/>
+    <w:basedOn w:val="DefaultParagraphFont"/>
+    <w:uiPriority w:val="99"/>
+    <w:semiHidden/>
+    <w:unhideWhenUsed/>
+    <w:rsid w:val="00DC3908"/>
+    <w:rPr>
+      <w:color w:val="605E5C"/>
+      <w:shd w:val="clear" w:color="auto" w:fill="E1DFDD"/>
+    </w:rPr>
   </w:style>
 </w:styles>
 </file>

</xml_diff>